<commit_message>
docs: synchronize assistant workflows and final group report
</commit_message>
<xml_diff>
--- a/ProjectReport/IRS-PM-2026-08-17-AIS08FT-GRP-Group7-RoadGuard-Group-Report.docx
+++ b/ProjectReport/IRS-PM-2026-08-17-AIS08FT-GRP-Group7-RoadGuard-Group-Report.docx
@@ -213,7 +213,7 @@
           <w:color w:val="000000"/>
           <w:sz w:val="24"/>
         </w:rPr>
-        <w:t>19 October 2026</w:t>
+        <w:t>21 October 2026</w:t>
       </w:r>
     </w:p>
     <w:p>
@@ -233,20 +233,28 @@
         <w:pageBreakBefore w:val="0"/>
         <w:jc w:val="center"/>
       </w:pPr>
+      <w:bookmarkStart w:id="1000" w:name="RGCurrentHeading0"/>
       <w:bookmarkStart w:id="0" w:name="_RGI_1"/>
       <w:r>
         <w:t>Abstract</w:t>
       </w:r>
       <w:bookmarkEnd w:id="0"/>
+      <w:bookmarkEnd w:id="1000"/>
     </w:p>
     <w:p>
       <w:r>
-        <w:t>RoadGuard integrates road-damage detection, rule-based decisions and maintenance scheduling for four crews in Jurong East and Jurong West. Inspectors upload geolocated images, a local YOLO11s model selects one primary damage observation, and a confidence policy either creates a repair task or requests human review. A genetic algorithm and a Greedy baseline then allocate accepted work from a common NUS-ISS dispatch origin. A shared web application supports inspectors, dispatchers and crew accounts, with persistent task history and revision checks.</w:t>
+        <w:rPr>
+          <w:color w:val="000000"/>
+        </w:rPr>
+        <w:t>RoadGuard integrates road-damage detection, rule-based decisions and maintenance scheduling for four crews in Jurong East and Jurong West. Inspectors upload geolocated images, a local YOLO11s model selects one primary damage observation, and a confidence policy either creates a repair task or requests human review. A genetic algorithm and a Greedy baseline then allocate accepted work from a common NUS-ISS dispatch origin. A shared web application supports inspectors, dispatchers and crew accounts, with persistent task history and revision checks. A dispatcher assistant retrieves reviewed project knowledge and saved-plan evidence, while separate preview and confirmation workflows support persistent crew assignment and task cancellation.</w:t>
       </w:r>
     </w:p>
     <w:p>
       <w:r>
-        <w:t>Evaluation combines visual-recognition experiments, twelve routing scenarios and integrated workflow tests. Model and inference refinements improved recognition, but reliable damage typing and independent local validation remain unresolved. Greedy-seeded search improved the scheduling result in all 120 default-budget runs, with scenario-mean objective reductions of 0.73–3.62%. Workflow acceptance demonstrates a functioning inspection-to-completion prototype. The contribution is an integrated decision process with retained evidence, human correction and constrained crew planning; operational deployment requires calibrated acceptance rules, measured service assumptions and further field evaluation.</w:t>
+        <w:rPr>
+          <w:color w:val="000000"/>
+        </w:rPr>
+        <w:t>Evaluation combines visual-recognition experiments, twelve routing scenarios and integrated workflow tests. Recognition reliability and independent local validation remain unresolved. Greedy-seeded search improved the scheduling result in all 120 default-budget runs, with scenario-mean objective reductions of 0.73–3.62%. Targeted assistant checks include actual GPT responses, local retrieval and confirmed task-change acceptance; they do not establish broad semantic accuracy. The contribution is an integrated decision process with retained evidence, human correction and constrained crew planning. Operational deployment requires calibrated rules, measured service assumptions and further field evaluation.</w:t>
       </w:r>
     </w:p>
     <w:p>
@@ -287,12 +295,13 @@
     <w:p>
       <w:pPr>
         <w:pStyle w:val="168"/>
+        <w:spacing w:after="30"/>
       </w:pPr>
       <w:r>
         <w:fldChar w:fldCharType="begin"/>
       </w:r>
       <w:r>
-        <w:instrText xml:space="preserve"> HYPERLINK \l "_RGI_1" \h </w:instrText>
+        <w:instrText xml:space="preserve"> HYPERLINK \l "RGCurrentHeading0" </w:instrText>
       </w:r>
       <w:r>
         <w:fldChar w:fldCharType="separate"/>
@@ -313,12 +322,13 @@
     <w:p>
       <w:pPr>
         <w:pStyle w:val="168"/>
+        <w:spacing w:after="30"/>
       </w:pPr>
       <w:r>
         <w:fldChar w:fldCharType="begin"/>
       </w:r>
       <w:r>
-        <w:instrText xml:space="preserve"> HYPERLINK \l "_RGI_2" \h </w:instrText>
+        <w:instrText xml:space="preserve"> HYPERLINK \l "RGCurrentHeading1" </w:instrText>
       </w:r>
       <w:r>
         <w:fldChar w:fldCharType="separate"/>
@@ -339,12 +349,13 @@
     <w:p>
       <w:pPr>
         <w:pStyle w:val="169"/>
+        <w:spacing w:after="30"/>
       </w:pPr>
       <w:r>
         <w:fldChar w:fldCharType="begin"/>
       </w:r>
       <w:r>
-        <w:instrText xml:space="preserve"> HYPERLINK \l "_RGI_3" \h </w:instrText>
+        <w:instrText xml:space="preserve"> HYPERLINK \l "RGCurrentHeading2" </w:instrText>
       </w:r>
       <w:r>
         <w:fldChar w:fldCharType="separate"/>
@@ -365,12 +376,13 @@
     <w:p>
       <w:pPr>
         <w:pStyle w:val="169"/>
+        <w:spacing w:after="30"/>
       </w:pPr>
       <w:r>
         <w:fldChar w:fldCharType="begin"/>
       </w:r>
       <w:r>
-        <w:instrText xml:space="preserve"> HYPERLINK \l "_RGI_4" \h </w:instrText>
+        <w:instrText xml:space="preserve"> HYPERLINK \l "RGCurrentHeading3" </w:instrText>
       </w:r>
       <w:r>
         <w:fldChar w:fldCharType="separate"/>
@@ -391,12 +403,13 @@
     <w:p>
       <w:pPr>
         <w:pStyle w:val="169"/>
+        <w:spacing w:after="30"/>
       </w:pPr>
       <w:r>
         <w:fldChar w:fldCharType="begin"/>
       </w:r>
       <w:r>
-        <w:instrText xml:space="preserve"> HYPERLINK \l "_RGI_5" \h </w:instrText>
+        <w:instrText xml:space="preserve"> HYPERLINK \l "RGCurrentHeading4" </w:instrText>
       </w:r>
       <w:r>
         <w:fldChar w:fldCharType="separate"/>
@@ -417,12 +430,13 @@
     <w:p>
       <w:pPr>
         <w:pStyle w:val="168"/>
+        <w:spacing w:after="30"/>
       </w:pPr>
       <w:r>
         <w:fldChar w:fldCharType="begin"/>
       </w:r>
       <w:r>
-        <w:instrText xml:space="preserve"> HYPERLINK \l "_RGI_6" \h </w:instrText>
+        <w:instrText xml:space="preserve"> HYPERLINK \l "RGCurrentHeading5" </w:instrText>
       </w:r>
       <w:r>
         <w:fldChar w:fldCharType="separate"/>
@@ -437,18 +451,19 @@
         <w:tab/>
       </w:r>
       <w:r>
-        <w:t>4</w:t>
+        <w:t>3</w:t>
       </w:r>
     </w:p>
     <w:p>
       <w:pPr>
         <w:pStyle w:val="168"/>
+        <w:spacing w:after="30"/>
       </w:pPr>
       <w:r>
         <w:fldChar w:fldCharType="begin"/>
       </w:r>
       <w:r>
-        <w:instrText xml:space="preserve"> HYPERLINK \l "_RGI_7" \h </w:instrText>
+        <w:instrText xml:space="preserve"> HYPERLINK \l "RGCurrentHeading6" </w:instrText>
       </w:r>
       <w:r>
         <w:fldChar w:fldCharType="separate"/>
@@ -463,18 +478,19 @@
         <w:tab/>
       </w:r>
       <w:r>
-        <w:t>6</w:t>
+        <w:t>5</w:t>
       </w:r>
     </w:p>
     <w:p>
       <w:pPr>
         <w:pStyle w:val="169"/>
+        <w:spacing w:after="30"/>
       </w:pPr>
       <w:r>
         <w:fldChar w:fldCharType="begin"/>
       </w:r>
       <w:r>
-        <w:instrText xml:space="preserve"> HYPERLINK \l "_RGI_8" \h </w:instrText>
+        <w:instrText xml:space="preserve"> HYPERLINK \l "RGCurrentHeading7" </w:instrText>
       </w:r>
       <w:r>
         <w:fldChar w:fldCharType="separate"/>
@@ -489,18 +505,19 @@
         <w:tab/>
       </w:r>
       <w:r>
-        <w:t>6</w:t>
+        <w:t>5</w:t>
       </w:r>
     </w:p>
     <w:p>
       <w:pPr>
         <w:pStyle w:val="169"/>
+        <w:spacing w:after="30"/>
       </w:pPr>
       <w:r>
         <w:fldChar w:fldCharType="begin"/>
       </w:r>
       <w:r>
-        <w:instrText xml:space="preserve"> HYPERLINK \l "_RGI_9" \h </w:instrText>
+        <w:instrText xml:space="preserve"> HYPERLINK \l "RGCurrentHeading8" </w:instrText>
       </w:r>
       <w:r>
         <w:fldChar w:fldCharType="separate"/>
@@ -515,18 +532,19 @@
         <w:tab/>
       </w:r>
       <w:r>
-        <w:t>6</w:t>
+        <w:t>5</w:t>
       </w:r>
     </w:p>
     <w:p>
       <w:pPr>
         <w:pStyle w:val="169"/>
+        <w:spacing w:after="30"/>
       </w:pPr>
       <w:r>
         <w:fldChar w:fldCharType="begin"/>
       </w:r>
       <w:r>
-        <w:instrText xml:space="preserve"> HYPERLINK \l "_RGI_10" \h </w:instrText>
+        <w:instrText xml:space="preserve"> HYPERLINK \l "RGCurrentHeading9" </w:instrText>
       </w:r>
       <w:r>
         <w:fldChar w:fldCharType="separate"/>
@@ -541,18 +559,19 @@
         <w:tab/>
       </w:r>
       <w:r>
-        <w:t>7</w:t>
+        <w:t>6</w:t>
       </w:r>
     </w:p>
     <w:p>
       <w:pPr>
         <w:pStyle w:val="169"/>
+        <w:spacing w:after="30"/>
       </w:pPr>
       <w:r>
         <w:fldChar w:fldCharType="begin"/>
       </w:r>
       <w:r>
-        <w:instrText xml:space="preserve"> HYPERLINK \l "_RGI_12" \h </w:instrText>
+        <w:instrText xml:space="preserve"> HYPERLINK \l "RGCurrentHeading10" </w:instrText>
       </w:r>
       <w:r>
         <w:fldChar w:fldCharType="separate"/>
@@ -573,12 +592,13 @@
     <w:p>
       <w:pPr>
         <w:pStyle w:val="169"/>
+        <w:spacing w:after="30"/>
       </w:pPr>
       <w:r>
         <w:fldChar w:fldCharType="begin"/>
       </w:r>
       <w:r>
-        <w:instrText xml:space="preserve"> HYPERLINK \l "_RGI_13" \h </w:instrText>
+        <w:instrText xml:space="preserve"> HYPERLINK \l "RGCurrentHeading11" </w:instrText>
       </w:r>
       <w:r>
         <w:fldChar w:fldCharType="separate"/>
@@ -599,12 +619,13 @@
     <w:p>
       <w:pPr>
         <w:pStyle w:val="168"/>
+        <w:spacing w:after="30"/>
       </w:pPr>
       <w:r>
         <w:fldChar w:fldCharType="begin"/>
       </w:r>
       <w:r>
-        <w:instrText xml:space="preserve"> HYPERLINK \l "_RGI_21" \h </w:instrText>
+        <w:instrText xml:space="preserve"> HYPERLINK \l "RGCurrentHeading12" </w:instrText>
       </w:r>
       <w:r>
         <w:fldChar w:fldCharType="separate"/>
@@ -625,12 +646,13 @@
     <w:p>
       <w:pPr>
         <w:pStyle w:val="168"/>
+        <w:spacing w:after="30"/>
       </w:pPr>
       <w:r>
         <w:fldChar w:fldCharType="begin"/>
       </w:r>
       <w:r>
-        <w:instrText xml:space="preserve"> HYPERLINK \l "_RGI_22" \h </w:instrText>
+        <w:instrText xml:space="preserve"> HYPERLINK \l "RGCurrentHeading13" </w:instrText>
       </w:r>
       <w:r>
         <w:fldChar w:fldCharType="separate"/>
@@ -651,12 +673,13 @@
     <w:p>
       <w:pPr>
         <w:pStyle w:val="169"/>
+        <w:spacing w:after="30"/>
       </w:pPr>
       <w:r>
         <w:fldChar w:fldCharType="begin"/>
       </w:r>
       <w:r>
-        <w:instrText xml:space="preserve"> HYPERLINK \l "_RGI_23" \h </w:instrText>
+        <w:instrText xml:space="preserve"> HYPERLINK \l "RGCurrentHeading14" </w:instrText>
       </w:r>
       <w:r>
         <w:fldChar w:fldCharType="separate"/>
@@ -677,12 +700,13 @@
     <w:p>
       <w:pPr>
         <w:pStyle w:val="169"/>
+        <w:spacing w:after="30"/>
       </w:pPr>
       <w:r>
         <w:fldChar w:fldCharType="begin"/>
       </w:r>
       <w:r>
-        <w:instrText xml:space="preserve"> HYPERLINK \l "_RGI_25" \h </w:instrText>
+        <w:instrText xml:space="preserve"> HYPERLINK \l "RGCurrentHeading15" </w:instrText>
       </w:r>
       <w:r>
         <w:fldChar w:fldCharType="separate"/>
@@ -703,12 +727,13 @@
     <w:p>
       <w:pPr>
         <w:pStyle w:val="169"/>
+        <w:spacing w:after="30"/>
       </w:pPr>
       <w:r>
         <w:fldChar w:fldCharType="begin"/>
       </w:r>
       <w:r>
-        <w:instrText xml:space="preserve"> HYPERLINK \l "_RGI_26" \h </w:instrText>
+        <w:instrText xml:space="preserve"> HYPERLINK \l "RGCurrentHeading16" </w:instrText>
       </w:r>
       <w:r>
         <w:fldChar w:fldCharType="separate"/>
@@ -729,12 +754,13 @@
     <w:p>
       <w:pPr>
         <w:pStyle w:val="168"/>
+        <w:spacing w:after="30"/>
       </w:pPr>
       <w:r>
         <w:fldChar w:fldCharType="begin"/>
       </w:r>
       <w:r>
-        <w:instrText xml:space="preserve"> HYPERLINK \l "_RGI_27" \h </w:instrText>
+        <w:instrText xml:space="preserve"> HYPERLINK \l "RGCurrentHeading17" </w:instrText>
       </w:r>
       <w:r>
         <w:fldChar w:fldCharType="separate"/>
@@ -749,18 +775,19 @@
         <w:tab/>
       </w:r>
       <w:r>
-        <w:t>17</w:t>
+        <w:t>18</w:t>
       </w:r>
     </w:p>
     <w:p>
       <w:pPr>
         <w:pStyle w:val="169"/>
+        <w:spacing w:after="30"/>
       </w:pPr>
       <w:r>
         <w:fldChar w:fldCharType="begin"/>
       </w:r>
       <w:r>
-        <w:instrText xml:space="preserve"> HYPERLINK \l "_RGI_28" \h </w:instrText>
+        <w:instrText xml:space="preserve"> HYPERLINK \l "RGCurrentHeading18" </w:instrText>
       </w:r>
       <w:r>
         <w:fldChar w:fldCharType="separate"/>
@@ -775,18 +802,19 @@
         <w:tab/>
       </w:r>
       <w:r>
-        <w:t>17</w:t>
+        <w:t>18</w:t>
       </w:r>
     </w:p>
     <w:p>
       <w:pPr>
         <w:pStyle w:val="169"/>
+        <w:spacing w:after="30"/>
       </w:pPr>
       <w:r>
         <w:fldChar w:fldCharType="begin"/>
       </w:r>
       <w:r>
-        <w:instrText xml:space="preserve"> HYPERLINK \l "_RGI_29" \h </w:instrText>
+        <w:instrText xml:space="preserve"> HYPERLINK \l "RGCurrentHeading19" </w:instrText>
       </w:r>
       <w:r>
         <w:fldChar w:fldCharType="separate"/>
@@ -801,18 +829,19 @@
         <w:tab/>
       </w:r>
       <w:r>
-        <w:t>17</w:t>
+        <w:t>18</w:t>
       </w:r>
     </w:p>
     <w:p>
       <w:pPr>
         <w:pStyle w:val="168"/>
+        <w:spacing w:after="30"/>
       </w:pPr>
       <w:r>
         <w:fldChar w:fldCharType="begin"/>
       </w:r>
       <w:r>
-        <w:instrText xml:space="preserve"> HYPERLINK \l "_RGI_14" \h </w:instrText>
+        <w:instrText xml:space="preserve"> HYPERLINK \l "RGCurrentHeading20" </w:instrText>
       </w:r>
       <w:r>
         <w:fldChar w:fldCharType="separate"/>
@@ -827,24 +856,25 @@
         <w:tab/>
       </w:r>
       <w:r>
-        <w:t>18</w:t>
+        <w:t>19</w:t>
       </w:r>
     </w:p>
     <w:p>
       <w:pPr>
         <w:pStyle w:val="169"/>
+        <w:spacing w:after="30"/>
       </w:pPr>
       <w:r>
         <w:fldChar w:fldCharType="begin"/>
       </w:r>
       <w:r>
-        <w:instrText xml:space="preserve"> HYPERLINK \l "_RGI_15" \h </w:instrText>
+        <w:instrText xml:space="preserve"> HYPERLINK \l "RGCurrentHeading21" </w:instrText>
       </w:r>
       <w:r>
         <w:fldChar w:fldCharType="separate"/>
       </w:r>
       <w:r>
-        <w:t>A.1 Environment and Dependencies</w:t>
+        <w:t>A.1 Environment and dependencies</w:t>
       </w:r>
       <w:r>
         <w:fldChar w:fldCharType="end"/>
@@ -853,24 +883,25 @@
         <w:tab/>
       </w:r>
       <w:r>
-        <w:t>18</w:t>
+        <w:t>19</w:t>
       </w:r>
     </w:p>
     <w:p>
       <w:pPr>
         <w:pStyle w:val="169"/>
+        <w:spacing w:after="30"/>
       </w:pPr>
       <w:r>
         <w:fldChar w:fldCharType="begin"/>
       </w:r>
       <w:r>
-        <w:instrText xml:space="preserve"> HYPERLINK \l "_RGI_16" \h </w:instrText>
+        <w:instrText xml:space="preserve"> HYPERLINK \l "RGCurrentHeading22" </w:instrText>
       </w:r>
       <w:r>
         <w:fldChar w:fldCharType="separate"/>
       </w:r>
       <w:r>
-        <w:t>A.2 Accounts and Local Configuration</w:t>
+        <w:t>A.2 Local retrieval and optional GPT configuration</w:t>
       </w:r>
       <w:r>
         <w:fldChar w:fldCharType="end"/>
@@ -879,24 +910,25 @@
         <w:tab/>
       </w:r>
       <w:r>
-        <w:t>18</w:t>
+        <w:t>19</w:t>
       </w:r>
     </w:p>
     <w:p>
       <w:pPr>
         <w:pStyle w:val="169"/>
+        <w:spacing w:after="30"/>
       </w:pPr>
       <w:r>
         <w:fldChar w:fldCharType="begin"/>
       </w:r>
       <w:r>
-        <w:instrText xml:space="preserve"> HYPERLINK \l "_RGI_17" \h </w:instrText>
+        <w:instrText xml:space="preserve"> HYPERLINK \l "RGCurrentHeading23" </w:instrText>
       </w:r>
       <w:r>
         <w:fldChar w:fldCharType="separate"/>
       </w:r>
       <w:r>
-        <w:t>A.3 Starting the Application</w:t>
+        <w:t>A.3 Accounts and data</w:t>
       </w:r>
       <w:r>
         <w:fldChar w:fldCharType="end"/>
@@ -905,24 +937,25 @@
         <w:tab/>
       </w:r>
       <w:r>
-        <w:t>18</w:t>
+        <w:t>20</w:t>
       </w:r>
     </w:p>
     <w:p>
       <w:pPr>
         <w:pStyle w:val="169"/>
+        <w:spacing w:after="30"/>
       </w:pPr>
       <w:r>
         <w:fldChar w:fldCharType="begin"/>
       </w:r>
       <w:r>
-        <w:instrText xml:space="preserve"> HYPERLINK \l "_RGI_18" \h </w:instrText>
+        <w:instrText xml:space="preserve"> HYPERLINK \l "RGCurrentHeading24" </w:instrText>
       </w:r>
       <w:r>
         <w:fldChar w:fldCharType="separate"/>
       </w:r>
       <w:r>
-        <w:t>A.4 User Workflow</w:t>
+        <w:t>A.4 Start the application</w:t>
       </w:r>
       <w:r>
         <w:fldChar w:fldCharType="end"/>
@@ -931,24 +964,25 @@
         <w:tab/>
       </w:r>
       <w:r>
-        <w:t>19</w:t>
+        <w:t>21</w:t>
       </w:r>
     </w:p>
     <w:p>
       <w:pPr>
         <w:pStyle w:val="169"/>
+        <w:spacing w:after="30"/>
       </w:pPr>
       <w:r>
         <w:fldChar w:fldCharType="begin"/>
       </w:r>
       <w:r>
-        <w:instrText xml:space="preserve"> HYPERLINK \l "_RGI_19" \h </w:instrText>
+        <w:instrText xml:space="preserve"> HYPERLINK \l "RGCurrentHeading25" </w:instrText>
       </w:r>
       <w:r>
         <w:fldChar w:fldCharType="separate"/>
       </w:r>
       <w:r>
-        <w:t>A.5 API Testing and Troubleshooting</w:t>
+        <w:t>A.5 User workflow</w:t>
       </w:r>
       <w:r>
         <w:fldChar w:fldCharType="end"/>
@@ -957,24 +991,25 @@
         <w:tab/>
       </w:r>
       <w:r>
-        <w:t>20</w:t>
+        <w:t>21</w:t>
       </w:r>
     </w:p>
     <w:p>
       <w:pPr>
         <w:pStyle w:val="169"/>
+        <w:spacing w:after="30"/>
       </w:pPr>
       <w:r>
         <w:fldChar w:fldCharType="begin"/>
       </w:r>
       <w:r>
-        <w:instrText xml:space="preserve"> HYPERLINK \l "_RGI_20" \h </w:instrText>
+        <w:instrText xml:space="preserve"> HYPERLINK \l "RGCurrentHeading26" </w:instrText>
       </w:r>
       <w:r>
         <w:fldChar w:fldCharType="separate"/>
       </w:r>
       <w:r>
-        <w:t>A.6 Optional Travel Time Provider</w:t>
+        <w:t>A.6 Dispatcher evidence questions</w:t>
       </w:r>
       <w:r>
         <w:fldChar w:fldCharType="end"/>
@@ -983,18 +1018,100 @@
         <w:tab/>
       </w:r>
       <w:r>
-        <w:t>20</w:t>
+        <w:t>22</w:t>
+      </w:r>
+    </w:p>
+    <w:p>
+      <w:pPr>
+        <w:pStyle w:val="169"/>
+        <w:spacing w:after="30"/>
+      </w:pPr>
+      <w:r>
+        <w:fldChar w:fldCharType="begin"/>
+      </w:r>
+      <w:r>
+        <w:instrText xml:space="preserve"> HYPERLINK \l "RGCurrentHeading27" </w:instrText>
+      </w:r>
+      <w:r>
+        <w:fldChar w:fldCharType="separate"/>
+      </w:r>
+      <w:r>
+        <w:t>A.7 Dispatcher route previews and confirmed adjustments</w:t>
+      </w:r>
+      <w:r>
+        <w:fldChar w:fldCharType="end"/>
+      </w:r>
+      <w:r>
+        <w:tab/>
+      </w:r>
+      <w:r>
+        <w:t>23</w:t>
+      </w:r>
+    </w:p>
+    <w:p>
+      <w:pPr>
+        <w:pStyle w:val="169"/>
+        <w:spacing w:after="30"/>
+      </w:pPr>
+      <w:r>
+        <w:fldChar w:fldCharType="begin"/>
+      </w:r>
+      <w:r>
+        <w:instrText xml:space="preserve"> HYPERLINK \l "RGCurrentHeading28" </w:instrText>
+      </w:r>
+      <w:r>
+        <w:fldChar w:fldCharType="separate"/>
+      </w:r>
+      <w:r>
+        <w:t>A.8 API testing and troubleshooting</w:t>
+      </w:r>
+      <w:r>
+        <w:fldChar w:fldCharType="end"/>
+      </w:r>
+      <w:r>
+        <w:tab/>
+      </w:r>
+      <w:r>
+        <w:t>23</w:t>
+      </w:r>
+    </w:p>
+    <w:p>
+      <w:pPr>
+        <w:pStyle w:val="169"/>
+        <w:spacing w:after="30"/>
+      </w:pPr>
+      <w:r>
+        <w:fldChar w:fldCharType="begin"/>
+      </w:r>
+      <w:r>
+        <w:instrText xml:space="preserve"> HYPERLINK \l "RGCurrentHeading29" </w:instrText>
+      </w:r>
+      <w:r>
+        <w:fldChar w:fldCharType="separate"/>
+      </w:r>
+      <w:r>
+        <w:t>A.9 Optional Google travel estimates</w:t>
+      </w:r>
+      <w:r>
+        <w:fldChar w:fldCharType="end"/>
+      </w:r>
+      <w:r>
+        <w:tab/>
+      </w:r>
+      <w:r>
+        <w:t>24</w:t>
       </w:r>
     </w:p>
     <w:p>
       <w:pPr>
         <w:pStyle w:val="168"/>
+        <w:spacing w:after="30"/>
       </w:pPr>
       <w:r>
         <w:fldChar w:fldCharType="begin"/>
       </w:r>
       <w:r>
-        <w:instrText xml:space="preserve"> HYPERLINK \l "appendix_b_proposal" \h </w:instrText>
+        <w:instrText xml:space="preserve"> HYPERLINK \l "RGCurrentHeading30" </w:instrText>
       </w:r>
       <w:r>
         <w:fldChar w:fldCharType="separate"/>
@@ -1009,18 +1126,19 @@
         <w:tab/>
       </w:r>
       <w:r>
-        <w:t>21</w:t>
+        <w:t>26</w:t>
       </w:r>
     </w:p>
     <w:p>
       <w:pPr>
         <w:pStyle w:val="168"/>
+        <w:spacing w:after="30"/>
       </w:pPr>
       <w:r>
         <w:fldChar w:fldCharType="begin"/>
       </w:r>
       <w:r>
-        <w:instrText xml:space="preserve"> HYPERLINK \l "appendix_c_mapping" \h </w:instrText>
+        <w:instrText xml:space="preserve"> HYPERLINK \l "RGCurrentHeading31" </w:instrText>
       </w:r>
       <w:r>
         <w:fldChar w:fldCharType="separate"/>
@@ -1035,10 +1153,7 @@
         <w:tab/>
       </w:r>
       <w:r>
-        <w:t>34</w:t>
-      </w:r>
-      <w:r>
-        <w:fldChar w:fldCharType="end"/>
+        <w:t>39</w:t>
       </w:r>
     </w:p>
     <w:p>
@@ -1059,11 +1174,13 @@
         <w:pageBreakBefore w:val="0"/>
         <w:jc w:val="left"/>
       </w:pPr>
+      <w:bookmarkStart w:id="1001" w:name="RGCurrentHeading1"/>
       <w:bookmarkStart w:id="1" w:name="_RGI_2"/>
       <w:r>
         <w:t>1 Introduction</w:t>
       </w:r>
       <w:bookmarkEnd w:id="1"/>
+      <w:bookmarkEnd w:id="1001"/>
     </w:p>
     <w:p>
       <w:pPr>
@@ -1071,11 +1188,13 @@
         <w:pageBreakBefore w:val="0"/>
         <w:jc w:val="left"/>
       </w:pPr>
+      <w:bookmarkStart w:id="1002" w:name="RGCurrentHeading2"/>
       <w:bookmarkStart w:id="2" w:name="_RGI_3"/>
       <w:r>
         <w:t>1.1 Background and Problem Statement</w:t>
       </w:r>
       <w:bookmarkEnd w:id="2"/>
+      <w:bookmarkEnd w:id="1002"/>
     </w:p>
     <w:p>
       <w:r>
@@ -1104,11 +1223,13 @@
         <w:pageBreakBefore w:val="0"/>
         <w:jc w:val="left"/>
       </w:pPr>
+      <w:bookmarkStart w:id="1003" w:name="RGCurrentHeading3"/>
       <w:bookmarkStart w:id="3" w:name="_RGI_4"/>
       <w:r>
         <w:t>1.2 Related Work and Contribution</w:t>
       </w:r>
       <w:bookmarkEnd w:id="3"/>
+      <w:bookmarkEnd w:id="1003"/>
     </w:p>
     <w:p>
       <w:r>
@@ -1126,20 +1247,28 @@
         <w:pageBreakBefore w:val="0"/>
         <w:jc w:val="left"/>
       </w:pPr>
+      <w:bookmarkStart w:id="1004" w:name="RGCurrentHeading4"/>
       <w:bookmarkStart w:id="4" w:name="_RGI_5"/>
       <w:r>
         <w:t>1.3 Scope and Project Evolution</w:t>
       </w:r>
       <w:bookmarkEnd w:id="4"/>
+      <w:bookmarkEnd w:id="1004"/>
     </w:p>
     <w:p>
       <w:r>
-        <w:t>The scenario models one maintenance department with four crews serving eligible public motor roads in Jurong East and Jurong West within frozen URA Master Plan 2025 boundaries. A shared simulated origin is located at NUS-ISS. Expressway mainlines and ramps, and private or restricted internal roads, are excluded. The backend checks the geographic boundary; road type is user-declared. This does not describe an actual NUS-ISS maintenance operation.</w:t>
+        <w:rPr>
+          <w:color w:val="000000"/>
+        </w:rPr>
+        <w:t>Four crews serve eligible public motor roads in Jurong East and West within frozen URA Master Plan 2025 boundaries, using a simulated NUS-ISS origin. Expressway mainlines and ramps, and private or restricted roads, are excluded. The backend checks geography; road type is user-declared. This is not an actual NUS-ISS maintenance operation.</w:t>
       </w:r>
     </w:p>
     <w:p>
       <w:r>
-        <w:t>The delivered workflow covers one primary detection per image, confidence-based acceptance or review, rule-based tasks, explicit route recalculation, comparative schedules and crew completion. Table 1 distinguishes the submitted proposal, reproduced in Appendix B, from the delivered scope. Geographic restriction and four crews follow presentation feedback; the other differences are implementation decisions or incomplete scope.</w:t>
+        <w:rPr>
+          <w:color w:val="000000"/>
+        </w:rPr>
+        <w:t>The workflow covers primary detection, confidence review, rule-based tasks, explicit replanning, comparative schedules and crew completion, plus grounded answers and confirmed adjustments. Table 1 compares the delivered scope with the submitted proposal in Appendix B. Jurong restriction and four crews follow presentation feedback; other changes reflect implementation decisions or evaluation gaps.</w:t>
       </w:r>
     </w:p>
     <w:p>
@@ -1840,7 +1969,7 @@
                 <w:color w:val="000000"/>
                 <w:sz w:val="21"/>
               </w:rPr>
-              <w:t>Prepared knowledge and placeholder only; not implemented</w:t>
+              <w:t>Chroma/E5 and optional GPT answers; confirmed adjustments; targeted evaluation</w:t>
             </w:r>
           </w:p>
         </w:tc>
@@ -2075,7 +2204,10 @@
         <w:spacing w:before="120"/>
       </w:pPr>
       <w:r>
-        <w:t>The routing examples use a 480-minute shift and return to the depot, while the shared project configuration still treats those policies as unresolved. They remain demonstration assumptions. The planned GPT/RAG service and its confirmed-change workflow have not been implemented; prepared knowledge and an interface placeholder are not evaluated assistant functionality.</w:t>
+        <w:rPr>
+          <w:color w:val="000000"/>
+        </w:rPr>
+        <w:t>The configurable 480-minute shift and depot return remain unapproved operational assumptions. GPT/RAG and preview–confirm–replan are implemented; targeted acceptance does not establish the full question-and-change evaluation proposed in Appendix B.</w:t>
       </w:r>
     </w:p>
     <w:p>
@@ -2084,11 +2216,13 @@
         <w:pageBreakBefore/>
         <w:jc w:val="left"/>
       </w:pPr>
+      <w:bookmarkStart w:id="1005" w:name="RGCurrentHeading5"/>
       <w:bookmarkStart w:id="5" w:name="_RGI_6"/>
       <w:r>
         <w:t>2 Data and Knowledge Preparation</w:t>
       </w:r>
       <w:bookmarkEnd w:id="5"/>
+      <w:bookmarkEnd w:id="1005"/>
     </w:p>
     <w:p>
       <w:r>
@@ -2864,7 +2998,10 @@
     </w:p>
     <w:p>
       <w:r>
-        <w:t>Versioned business rules encode severity, priority, service minutes and explanations. A source-hashed knowledge package records scope, label meanings, rules and workflow. It was checked against repository content, not approved by engineering experts. The visual qualifiers “wide”, “sunken” and “deep” are categorical labels, not measurements of width, depth or structural condition.</w:t>
+        <w:rPr>
+          <w:color w:val="000000"/>
+        </w:rPr>
+        <w:t>Versioned business rules encode severity, priority, service minutes and explanations. The source-hashed a-knowledge-v17 package records reviewed scope, label meanings, rules and workflows; it is indexed locally in ChromaDB with multilingual-e5-small embeddings. It was checked against repository content, not approved by engineering experts. Only reviewed static documents are indexed; authorized saved-plan facts are obtained separately. The visual qualifiers “wide”, “sunken” and “deep” are categorical labels, not measurements of width, depth or structural condition.</w:t>
       </w:r>
     </w:p>
     <w:p>
@@ -4220,11 +4357,13 @@
         <w:pageBreakBefore/>
         <w:jc w:val="left"/>
       </w:pPr>
+      <w:bookmarkStart w:id="1006" w:name="RGCurrentHeading6"/>
       <w:bookmarkStart w:id="6" w:name="_RGI_7"/>
       <w:r>
         <w:t>3 System Design and Implementation</w:t>
       </w:r>
       <w:bookmarkEnd w:id="6"/>
+      <w:bookmarkEnd w:id="1006"/>
     </w:p>
     <w:p>
       <w:pPr>
@@ -4232,15 +4371,20 @@
         <w:pageBreakBefore w:val="0"/>
         <w:jc w:val="left"/>
       </w:pPr>
+      <w:bookmarkStart w:id="1007" w:name="RGCurrentHeading7"/>
       <w:bookmarkStart w:id="7" w:name="_RGI_8"/>
       <w:r>
         <w:t>3.1 System Architecture</w:t>
       </w:r>
       <w:bookmarkEnd w:id="7"/>
+      <w:bookmarkEnd w:id="1007"/>
     </w:p>
     <w:p>
       <w:r>
-        <w:t>A React client uses one FastAPI backend and shared SQLite database. Separate services handle vision, rules, inspections, tasks, crews and planning. YOLO supplies both class and location evidence for review; explicit rules keep policy changes separate from model training. GA addresses the discrete combination of task assignment and visit order, while Greedy provides an interpretable baseline and a dependable initial solution.</w:t>
+        <w:rPr>
+          <w:color w:val="000000"/>
+        </w:rPr>
+        <w:t>A React client uses one FastAPI backend and shared SQLite database. Separate services handle vision, rules, inspections, tasks, crews and planning. YOLO supplies both class and location evidence for review; explicit rules keep policy changes separate from model training. GA addresses the discrete combination of task assignment and visit order, while Greedy provides an interpretable baseline and a dependable initial solution. A dispatcher-only assistant combines local Chroma/E5 retrieval with authorized saved-plan facts. Optional GPT generation selects server-owned evidence IDs; the server restores exact quotations for a guarded answer and derives canonical repair-rule answers from rule evidence. A separate adjustment service validates, confirms and persists changes without letting a generated answer authorize a business action.</w:t>
       </w:r>
     </w:p>
     <w:p>
@@ -4251,24 +4395,21 @@
       </w:pPr>
       <w:r>
         <w:drawing>
-          <wp:inline distT="0" distB="0" distL="114300" distR="114300">
-            <wp:extent cx="5852160" cy="2926080"/>
-            <wp:effectExtent l="0" t="0" r="15240" b="7620"/>
-            <wp:docPr id="1" name="Picture 1"/>
+          <wp:inline xmlns:a="http://schemas.openxmlformats.org/drawingml/2006/main" xmlns:pic="http://schemas.openxmlformats.org/drawingml/2006/picture">
+            <wp:extent cx="5760720" cy="2271052"/>
+            <wp:docPr id="17" name="Picture 17"/>
             <wp:cNvGraphicFramePr>
-              <a:graphicFrameLocks xmlns:a="http://schemas.openxmlformats.org/drawingml/2006/main" noChangeAspect="1"/>
+              <a:graphicFrameLocks noChangeAspect="1"/>
             </wp:cNvGraphicFramePr>
-            <a:graphic xmlns:a="http://schemas.openxmlformats.org/drawingml/2006/main">
+            <a:graphic>
               <a:graphicData uri="http://schemas.openxmlformats.org/drawingml/2006/picture">
-                <pic:pic xmlns:pic="http://schemas.openxmlformats.org/drawingml/2006/picture">
+                <pic:pic>
                   <pic:nvPicPr>
-                    <pic:cNvPr id="1" name="Picture 1"/>
-                    <pic:cNvPicPr>
-                      <a:picLocks noChangeAspect="1"/>
-                    </pic:cNvPicPr>
+                    <pic:cNvPr id="0" name="architecture-current.png"/>
+                    <pic:cNvPicPr/>
                   </pic:nvPicPr>
                   <pic:blipFill>
-                    <a:blip r:embed="rId12"/>
+                    <a:blip r:embed="rId31"/>
                     <a:stretch>
                       <a:fillRect/>
                     </a:stretch>
@@ -4276,11 +4417,9 @@
                   <pic:spPr>
                     <a:xfrm>
                       <a:off x="0" y="0"/>
-                      <a:ext cx="6080760" cy="3040380"/>
+                      <a:ext cx="5760720" cy="2271052"/>
                     </a:xfrm>
-                    <a:prstGeom prst="rect">
-                      <a:avLst/>
-                    </a:prstGeom>
+                    <a:prstGeom prst="rect"/>
                   </pic:spPr>
                 </pic:pic>
               </a:graphicData>
@@ -4310,7 +4449,10 @@
         <w:pStyle w:val="165"/>
       </w:pPr>
       <w:r>
-        <w:t>Note. The implemented services exclude the proposed GPT/RAG assistant. Planning is explicitly requested by the dispatcher.</w:t>
+        <w:rPr>
+          <w:color w:val="000000"/>
+        </w:rPr>
+        <w:t>Note. Evidence questions do not mutate business records. Confirmed adjustments persist separately; planning still requires an explicit dispatcher request. Source validation and bounded answer checks do not guarantee every semantic judgement.</w:t>
       </w:r>
     </w:p>
     <w:p>
@@ -4319,11 +4461,13 @@
         <w:pageBreakBefore w:val="0"/>
         <w:jc w:val="left"/>
       </w:pPr>
+      <w:bookmarkStart w:id="1008" w:name="RGCurrentHeading8"/>
       <w:bookmarkStart w:id="8" w:name="_RGI_9"/>
       <w:r>
         <w:t>3.2 Decision and Scheduling Semantics</w:t>
       </w:r>
       <w:bookmarkEnd w:id="8"/>
+      <w:bookmarkEnd w:id="1008"/>
     </w:p>
     <w:p>
       <w:r>
@@ -4332,7 +4476,10 @@
     </w:p>
     <w:p>
       <w:r>
-        <w:t>Both planners read the same active tasks, crew availability, travel matrix and constraints from a consistent revision. Greedy selects the earliest available crew and a feasible task by priority, then travel time. The GA encodes a task permutation and crew-owner vector. Tournament selection, order-preserving crossover, reassignment, swap, reversal, relocation and elitism explore alternatives; evaluation caching avoids duplicate scoring. Online search includes the Greedy solution, whereas unseeded GA is retained for experimental comparison.</w:t>
+        <w:rPr>
+          <w:color w:val="000000"/>
+        </w:rPr>
+        <w:t>Both planners read the same active tasks, crew availability, travel matrix and constraints from a consistent revision. Greedy selects the earliest available crew and a feasible task by priority, then travel time. The GA encodes a task permutation and crew-owner vector. Tournament selection, order-preserving crossover, reassignment, swap, reversal, relocation and elitism explore alternatives; evaluation caching avoids duplicate scoring. Online search includes the Greedy solution, whereas unseeded GA is retained for experimental comparison. Both planners also preserve durable task-to-crew constraints, including after a restart or the arrival of new tasks. Unavailable or infeasible constrained work remains explicitly unassigned rather than silently transferring crews.</w:t>
       </w:r>
     </w:p>
     <w:p>
@@ -4342,7 +4489,10 @@
     </w:p>
     <w:p>
       <w:r>
-        <w:t>Task or crew changes mark old plans stale. The dispatcher explicitly recalculates, and a superseded input revision is rejected before a new plan is saved. Completion removes work from later active snapshots but preserves history. Crew completion checks the latest GA assignment and task version in the same transaction, preventing an outdated browser from completing another crew’s reassigned task.</w:t>
+        <w:rPr>
+          <w:color w:val="000000"/>
+        </w:rPr>
+        <w:t>Task or crew changes mark old plans stale. The dispatcher explicitly recalculates, and a superseded input revision is rejected before a new plan is saved. A move preview retains all other assigned tasks and checks travel, service and configured return against the shift. Confirmation stores a durable crew constraint; cancellation retains history and removes active work. Stale or expired proposals, version conflicts, repeated confirmation and role/CSRF checks are handled explicitly. Reassignment immediately removes the previous crew’s task, inspection and completion access; the target crew receives access after a fresh saved GA plan. Completion also checks task version in the same transaction. The database schema is version 6.</w:t>
       </w:r>
     </w:p>
     <w:p>
@@ -4351,15 +4501,20 @@
         <w:pageBreakBefore w:val="0"/>
         <w:jc w:val="left"/>
       </w:pPr>
+      <w:bookmarkStart w:id="1009" w:name="RGCurrentHeading9"/>
       <w:bookmarkStart w:id="9" w:name="_RGI_10"/>
       <w:r>
         <w:t>3.3 Implementation and User Workspaces</w:t>
       </w:r>
       <w:bookmarkEnd w:id="9"/>
+      <w:bookmarkEnd w:id="1009"/>
     </w:p>
     <w:p>
       <w:r>
-        <w:t>The application supports uploads, inspection details, reviews, tasks, crew availability, route planning, algorithm comparison and a mobile crew workspace. Backend authorization enforces the role restrictions in Table 4 independently of visible navigation. Authentication uses hashed passwords and sessions, with CSRF checks for modifying requests.</w:t>
+        <w:rPr>
+          <w:color w:val="000000"/>
+        </w:rPr>
+        <w:t>The application supports uploads, inspection details, reviews, tasks, crew availability, route planning, algorithm comparison and a mobile crew workspace. Backend authorization enforces the role restrictions in Table 4 independently of visible navigation. Authentication uses hashed passwords and sessions, with CSRF checks for modifying requests. Route assistant presents English answers before default-collapsed View sources, and four saved-route crew cards with move/cancel previews. Query-v3 returns model identity from non-secret backend configuration without a provider call, gives explicit guidance for clearly unrelated questions, and retains strict evidence validation for repair and saved-route questions. Ambiguous or insufficient evidence remains explicit.</w:t>
       </w:r>
     </w:p>
     <w:p>
@@ -4691,7 +4846,7 @@
                 <w:color w:val="000000"/>
                 <w:sz w:val="21"/>
               </w:rPr>
-              <w:t>Review, tasks, crews, planning and comparison</w:t>
+              <w:t>Review, tasks, crews, planning, comparison, evidence questions and confirmed adjustments</w:t>
             </w:r>
           </w:p>
         </w:tc>
@@ -4836,7 +4991,7 @@
                 <w:color w:val="000000"/>
                 <w:sz w:val="21"/>
               </w:rPr>
-              <w:t>Cannot select another crew, replan or access global lists</w:t>
+              <w:t>Cannot select another crew, replan, adjust tasks or access global lists; reassignment revokes old access</w:t>
             </w:r>
           </w:p>
         </w:tc>
@@ -5012,15 +5167,20 @@
         <w:pageBreakBefore/>
         <w:jc w:val="left"/>
       </w:pPr>
+      <w:bookmarkStart w:id="1010" w:name="RGCurrentHeading10"/>
       <w:bookmarkStart w:id="10" w:name="_RGI_12"/>
       <w:r>
         <w:t>3.4 Application of Intelligent Reasoning Techniques</w:t>
       </w:r>
       <w:bookmarkEnd w:id="10"/>
+      <w:bookmarkEnd w:id="1010"/>
     </w:p>
     <w:p>
       <w:r>
-        <w:t>Learned visual perception supplies uncertain evidence; explicit rules determine the permitted business response; constrained search allocates accepted work. These complementary methods form the reasoning chain described in Sections 3.1 and 3.2. Appendix C maps the delivered functions to MR, RS and CGS, with implementation evidence, verification references and limitations.</w:t>
+        <w:rPr>
+          <w:color w:val="000000"/>
+        </w:rPr>
+        <w:t>Learned visual perception supplies uncertain evidence; explicit rules determine the permitted business response; constrained search allocates accepted work. Retrieval and optional language generation explain reviewed knowledge and saved-plan facts, with server-owned citations and bounded validation. Confirmed business adjustments remain a separate guarded workflow. These complementary methods form the reasoning chain described in Sections 3.1 and 3.2. Appendix C maps delivered functions to MR, RS and CGS, with evidence, verification references and limitations.</w:t>
       </w:r>
     </w:p>
     <w:p>
@@ -5029,11 +5189,13 @@
         <w:pageBreakBefore w:val="0"/>
         <w:jc w:val="left"/>
       </w:pPr>
+      <w:bookmarkStart w:id="1011" w:name="RGCurrentHeading11"/>
       <w:bookmarkStart w:id="11" w:name="_RGI_13"/>
       <w:r>
         <w:t>3.5 Team Contributions and Development Practice</w:t>
       </w:r>
       <w:bookmarkEnd w:id="11"/>
+      <w:bookmarkEnd w:id="1011"/>
     </w:p>
     <w:p>
       <w:pPr>
@@ -5504,7 +5666,7 @@
                 <w:color w:val="000000"/>
                 <w:sz w:val="21"/>
               </w:rPr>
-              <w:t>Frontend and assistant interface</w:t>
+              <w:t>Frontend and assistant</w:t>
             </w:r>
           </w:p>
         </w:tc>
@@ -5531,7 +5693,7 @@
                 <w:color w:val="000000"/>
                 <w:sz w:val="21"/>
               </w:rPr>
-              <w:t>Frontend foundation and workflow pages; map and comparison integration; assistant interface placeholder. The assistant backend remains unimplemented.</w:t>
+              <w:t>Frontend foundation and workflow pages; map and comparison integration; retrieval and confirmed-change assistant. Shared integration adds vector grounding and persistent task adjustments.</w:t>
             </w:r>
           </w:p>
         </w:tc>
@@ -5551,11 +5713,13 @@
         <w:pageBreakBefore/>
         <w:jc w:val="left"/>
       </w:pPr>
+      <w:bookmarkStart w:id="1012" w:name="RGCurrentHeading12"/>
       <w:bookmarkStart w:id="12" w:name="_RGI_21"/>
       <w:r>
         <w:t>4 Evaluation Methodology</w:t>
       </w:r>
       <w:bookmarkEnd w:id="12"/>
+      <w:bookmarkEnd w:id="1012"/>
     </w:p>
     <w:p>
       <w:r>
@@ -5596,11 +5760,13 @@
         <w:pageBreakBefore/>
         <w:jc w:val="left"/>
       </w:pPr>
+      <w:bookmarkStart w:id="1013" w:name="RGCurrentHeading13"/>
       <w:bookmarkStart w:id="13" w:name="_RGI_22"/>
       <w:r>
         <w:t>5 Results and Discussion</w:t>
       </w:r>
       <w:bookmarkEnd w:id="13"/>
+      <w:bookmarkEnd w:id="1013"/>
     </w:p>
     <w:p>
       <w:pPr>
@@ -5608,11 +5774,13 @@
         <w:pageBreakBefore w:val="0"/>
         <w:jc w:val="left"/>
       </w:pPr>
+      <w:bookmarkStart w:id="1014" w:name="RGCurrentHeading14"/>
       <w:bookmarkStart w:id="14" w:name="_RGI_23"/>
       <w:r>
         <w:t>5.1 Vision Performance and Error Analysis</w:t>
       </w:r>
       <w:bookmarkEnd w:id="14"/>
+      <w:bookmarkEnd w:id="1014"/>
     </w:p>
     <w:p>
       <w:r>
@@ -8732,11 +8900,13 @@
         <w:pageBreakBefore w:val="0"/>
         <w:jc w:val="left"/>
       </w:pPr>
+      <w:bookmarkStart w:id="1015" w:name="RGCurrentHeading15"/>
       <w:bookmarkStart w:id="15" w:name="_RGI_25"/>
       <w:r>
         <w:t>5.2 Routing Performance</w:t>
       </w:r>
       <w:bookmarkEnd w:id="15"/>
+      <w:bookmarkEnd w:id="1015"/>
     </w:p>
     <w:p>
       <w:r>
@@ -10834,11 +11004,13 @@
         <w:pageBreakBefore w:val="0"/>
         <w:jc w:val="left"/>
       </w:pPr>
+      <w:bookmarkStart w:id="1016" w:name="RGCurrentHeading16"/>
       <w:bookmarkStart w:id="16" w:name="_RGI_26"/>
       <w:r>
         <w:t>5.3 Integrated Workflow Verification</w:t>
       </w:r>
       <w:bookmarkEnd w:id="16"/>
+      <w:bookmarkEnd w:id="1016"/>
     </w:p>
     <w:p>
       <w:r>
@@ -11548,13 +11720,258 @@
           </w:p>
         </w:tc>
       </w:tr>
+      <w:tr>
+        <w:tblPrEx>
+          <w:tblCellMar>
+            <w:top w:w="0" w:type="dxa"/>
+            <w:left w:w="108" w:type="dxa"/>
+            <w:bottom w:w="0" w:type="dxa"/>
+            <w:right w:w="108" w:type="dxa"/>
+          </w:tblCellMar>
+        </w:tblPrEx>
+        <w:trPr>
+          <w:cantSplit/>
+        </w:trPr>
+        <w:tc>
+          <w:tcPr>
+            <w:tcW w:w="2664" w:type="dxa"/>
+            <w:tcBorders>
+              <w:top w:val="single" w:color="D9D9D9" w:sz="4" w:space="0"/>
+              <w:left w:val="single" w:color="D9D9D9" w:sz="4" w:space="0"/>
+              <w:bottom w:val="single" w:color="D9D9D9" w:sz="4" w:space="0"/>
+              <w:right w:val="single" w:color="D9D9D9" w:sz="4" w:space="0"/>
+            </w:tcBorders>
+            <w:tcMar>
+              <w:top w:w="75" w:type="dxa"/>
+              <w:left w:w="90" w:type="dxa"/>
+              <w:bottom w:w="75" w:type="dxa"/>
+              <w:right w:w="90" w:type="dxa"/>
+            </w:tcMar>
+            <w:vAlign w:val="center"/>
+          </w:tcPr>
+          <w:p>
+            <w:pPr>
+              <w:spacing w:after="40" w:line="264" w:lineRule="auto"/>
+              <w:jc w:val="left"/>
+            </w:pPr>
+            <w:r>
+              <w:rPr>
+                <w:rFonts w:ascii="Times New Roman" w:hAnsi="Times New Roman"/>
+                <w:b w:val="0"/>
+                <w:color w:val="000000"/>
+                <w:sz w:val="21"/>
+              </w:rPr>
+              <w:t>21 October assistant and task adjustments</w:t>
+            </w:r>
+          </w:p>
+        </w:tc>
+        <w:tc>
+          <w:tcPr>
+            <w:tcW w:w="3168" w:type="dxa"/>
+            <w:tcBorders>
+              <w:top w:val="single" w:color="D9D9D9" w:sz="4" w:space="0"/>
+              <w:left w:val="single" w:color="D9D9D9" w:sz="4" w:space="0"/>
+              <w:bottom w:val="single" w:color="D9D9D9" w:sz="4" w:space="0"/>
+              <w:right w:val="single" w:color="D9D9D9" w:sz="4" w:space="0"/>
+            </w:tcBorders>
+            <w:tcMar>
+              <w:top w:w="75" w:type="dxa"/>
+              <w:left w:w="90" w:type="dxa"/>
+              <w:bottom w:w="75" w:type="dxa"/>
+              <w:right w:w="90" w:type="dxa"/>
+            </w:tcMar>
+            <w:vAlign w:val="center"/>
+          </w:tcPr>
+          <w:p>
+            <w:pPr>
+              <w:spacing w:after="40" w:line="264" w:lineRule="auto"/>
+              <w:jc w:val="left"/>
+            </w:pPr>
+            <w:r>
+              <w:rPr>
+                <w:rFonts w:ascii="Times New Roman" w:hAnsi="Times New Roman"/>
+                <w:b w:val="0"/>
+                <w:color w:val="000000"/>
+                <w:sz w:val="21"/>
+              </w:rPr>
+              <w:t>Four direct cases / no provider calls; two actual grounded GPT calls; separate HTTP/browser records</w:t>
+            </w:r>
+          </w:p>
+        </w:tc>
+        <w:tc>
+          <w:tcPr>
+            <w:tcW w:w="3528" w:type="dxa"/>
+            <w:tcBorders>
+              <w:top w:val="single" w:color="D9D9D9" w:sz="4" w:space="0"/>
+              <w:left w:val="single" w:color="D9D9D9" w:sz="4" w:space="0"/>
+              <w:bottom w:val="single" w:color="D9D9D9" w:sz="4" w:space="0"/>
+              <w:right w:val="single" w:color="D9D9D9" w:sz="4" w:space="0"/>
+            </w:tcBorders>
+            <w:tcMar>
+              <w:top w:w="75" w:type="dxa"/>
+              <w:left w:w="90" w:type="dxa"/>
+              <w:bottom w:w="75" w:type="dxa"/>
+              <w:right w:w="90" w:type="dxa"/>
+            </w:tcMar>
+            <w:vAlign w:val="center"/>
+          </w:tcPr>
+          <w:p>
+            <w:pPr>
+              <w:spacing w:after="40" w:line="264" w:lineRule="auto"/>
+              <w:jc w:val="left"/>
+            </w:pPr>
+            <w:r>
+              <w:rPr>
+                <w:rFonts w:ascii="Times New Roman" w:hAnsi="Times New Roman"/>
+                <w:b w:val="0"/>
+                <w:color w:val="000000"/>
+                <w:sz w:val="21"/>
+              </w:rPr>
+              <w:t>Targeted grounding and durable confirmed-change acceptance; scopes overlap and are not a combined test total</w:t>
+            </w:r>
+          </w:p>
+        </w:tc>
+      </w:tr>
+      <w:tr>
+        <w:tblPrEx>
+          <w:tblCellMar>
+            <w:top w:w="0" w:type="dxa"/>
+            <w:left w:w="108" w:type="dxa"/>
+            <w:bottom w:w="0" w:type="dxa"/>
+            <w:right w:w="108" w:type="dxa"/>
+          </w:tblCellMar>
+        </w:tblPrEx>
+        <w:trPr>
+          <w:cantSplit/>
+        </w:trPr>
+        <w:tc>
+          <w:tcPr>
+            <w:tcW w:w="2664" w:type="dxa"/>
+            <w:tcBorders>
+              <w:top w:val="single" w:color="D9D9D9" w:sz="4" w:space="0"/>
+              <w:left w:val="single" w:color="D9D9D9" w:sz="4" w:space="0"/>
+              <w:bottom w:val="single" w:color="D9D9D9" w:sz="4" w:space="0"/>
+              <w:right w:val="single" w:color="D9D9D9" w:sz="4" w:space="0"/>
+            </w:tcBorders>
+            <w:tcMar>
+              <w:top w:w="75" w:type="dxa"/>
+              <w:left w:w="90" w:type="dxa"/>
+              <w:bottom w:w="75" w:type="dxa"/>
+              <w:right w:w="90" w:type="dxa"/>
+            </w:tcMar>
+            <w:vAlign w:val="center"/>
+          </w:tcPr>
+          <w:p>
+            <w:pPr>
+              <w:spacing w:after="40" w:line="264" w:lineRule="auto"/>
+              <w:jc w:val="left"/>
+            </w:pPr>
+            <w:r>
+              <w:rPr>
+                <w:rFonts w:ascii="Times New Roman" w:hAnsi="Times New Roman"/>
+                <w:b w:val="0"/>
+                <w:color w:val="000000"/>
+                <w:sz w:val="21"/>
+              </w:rPr>
+              <w:t>21 October release PR 36, merged as b8d0fdea</w:t>
+            </w:r>
+          </w:p>
+        </w:tc>
+        <w:tc>
+          <w:tcPr>
+            <w:tcW w:w="3168" w:type="dxa"/>
+            <w:tcBorders>
+              <w:top w:val="single" w:color="D9D9D9" w:sz="4" w:space="0"/>
+              <w:left w:val="single" w:color="D9D9D9" w:sz="4" w:space="0"/>
+              <w:bottom w:val="single" w:color="D9D9D9" w:sz="4" w:space="0"/>
+              <w:right w:val="single" w:color="D9D9D9" w:sz="4" w:space="0"/>
+            </w:tcBorders>
+            <w:tcMar>
+              <w:top w:w="75" w:type="dxa"/>
+              <w:left w:w="90" w:type="dxa"/>
+              <w:bottom w:w="75" w:type="dxa"/>
+              <w:right w:w="90" w:type="dxa"/>
+            </w:tcMar>
+            <w:vAlign w:val="center"/>
+          </w:tcPr>
+          <w:p>
+            <w:pPr>
+              <w:spacing w:after="40" w:line="264" w:lineRule="auto"/>
+              <w:jc w:val="left"/>
+            </w:pPr>
+            <w:r>
+              <w:rPr>
+                <w:rFonts w:ascii="Times New Roman" w:hAnsi="Times New Roman"/>
+                <w:b w:val="0"/>
+                <w:color w:val="000000"/>
+                <w:sz w:val="21"/>
+              </w:rPr>
+              <w:t>GitHub CI: 1,255 backend passed / 1 skipped; 179 frontend passed; lint, type checks and build passed. Local infrastructure guardrails: 49 passed.</w:t>
+            </w:r>
+          </w:p>
+        </w:tc>
+        <w:tc>
+          <w:tcPr>
+            <w:tcW w:w="3528" w:type="dxa"/>
+            <w:tcBorders>
+              <w:top w:val="single" w:color="D9D9D9" w:sz="4" w:space="0"/>
+              <w:left w:val="single" w:color="D9D9D9" w:sz="4" w:space="0"/>
+              <w:bottom w:val="single" w:color="D9D9D9" w:sz="4" w:space="0"/>
+              <w:right w:val="single" w:color="D9D9D9" w:sz="4" w:space="0"/>
+            </w:tcBorders>
+            <w:tcMar>
+              <w:top w:w="75" w:type="dxa"/>
+              <w:left w:w="90" w:type="dxa"/>
+              <w:bottom w:w="75" w:type="dxa"/>
+              <w:right w:w="90" w:type="dxa"/>
+            </w:tcMar>
+            <w:vAlign w:val="center"/>
+          </w:tcPr>
+          <w:p>
+            <w:pPr>
+              <w:spacing w:after="40" w:line="264" w:lineRule="auto"/>
+              <w:jc w:val="left"/>
+            </w:pPr>
+            <w:r>
+              <w:rPr>
+                <w:rFonts w:ascii="Times New Roman" w:hAnsi="Times New Roman"/>
+                <w:b w:val="0"/>
+                <w:color w:val="000000"/>
+                <w:sz w:val="21"/>
+              </w:rPr>
+              <w:t>GitHub run 39569241424 checked head 155d3183. Base CI omits optional vision dependencies; the YOLO test is skipped. Counts are distinct dated evidence, not additive to earlier suites.</w:t>
+            </w:r>
+          </w:p>
+        </w:tc>
+      </w:tr>
     </w:tbl>
     <w:p>
       <w:pPr>
         <w:spacing w:before="120"/>
       </w:pPr>
       <w:r>
-        <w:t>The release records in Table 11 have different scopes and are not an overall quality score. Table 12 reconciles evaluation with the original objectives. Injected detections verify rules and confidence branches; they do not establish model accuracy, engineering validity or user productivity.</w:t>
+        <w:rPr>
+          <w:color w:val="000000"/>
+        </w:rPr>
+        <w:t>The release records in Table 11 have different dates and scopes and are not an overall quality score. Historical 18 October counts remain separate from later assistant and adjustment acceptance; overlapping suites must not be summed. Table 12 reconciles evaluation with the original objectives. Injected detections and synthetic routes verify controlled branches, not model accuracy, engineering validity or user productivity.</w:t>
+      </w:r>
+    </w:p>
+    <w:p>
+      <w:pPr/>
+      <w:r>
+        <w:rPr>
+          <w:color w:val="000000"/>
+        </w:rPr>
+        <w:t>On 21 October, intent-routing-20261021.json records four local direct-answer cases with zero provider calls and two actual gpt-4.1-mini grounded calls. The deep-pothole response retained the demonstration P1/240-minute rule; the saved-plan response matched 98.8 travel and 165.0 service minutes. These calls used the then-current a-knowledge-v16 package; later hash normalization and the a-knowledge-v17 documentation refresh do not retroactively re-execute them. Local E5 retrieval, provider-double validation and synthetic route tests are separate evidence categories.</w:t>
+      </w:r>
+    </w:p>
+    <w:p>
+      <w:pPr/>
+      <w:r>
+        <w:rPr>
+          <w:color w:val="000000"/>
+        </w:rPr>
+        <w:t>The task-adjustment acceptance record adds isolated authenticated HTTP/browser checks of all four route cards, move/cancel previews, explicit confirmation and recalculation, persistent assignment constraints and crew-access changes. Constructed routes exercise shift infeasibility while retaining other tasks. These bounded records do not demonstrate that every proposed ten-question and ten-change case was executed, nor universal answer correctness.</w:t>
       </w:r>
     </w:p>
     <w:p>
@@ -12055,7 +12472,7 @@
                 <w:color w:val="000000"/>
                 <w:sz w:val="21"/>
               </w:rPr>
-              <w:t>Proposed ten route questions and ten changes were not evaluated because the assistant service is absent.</w:t>
+              <w:t>Grounded repair/saved-plan answers, direct intent routing and confirmed adjustments have targeted actual-provider, local retrieval and controlled HTTP/browser evidence. The full proposed ten-question and ten-change suite is not established; broad semantic and user evaluation remain outstanding.</w:t>
             </w:r>
           </w:p>
         </w:tc>
@@ -12146,75 +12563,117 @@
         <w:pageBreakBefore/>
         <w:jc w:val="left"/>
       </w:pPr>
+      <w:bookmarkStart w:id="1017" w:name="RGCurrentHeading17"/>
       <w:bookmarkStart w:id="17" w:name="_RGI_27"/>
       <w:r>
         <w:t>6 Conclusions and Future Work</w:t>
       </w:r>
       <w:bookmarkEnd w:id="17"/>
+      <w:bookmarkEnd w:id="1017"/>
     </w:p>
     <w:p>
       <w:pPr>
         <w:pStyle w:val="4"/>
         <w:pageBreakBefore w:val="0"/>
+        <w:spacing w:before="160" w:after="100"/>
         <w:jc w:val="left"/>
       </w:pPr>
+      <w:bookmarkStart w:id="1018" w:name="RGCurrentHeading18"/>
       <w:bookmarkStart w:id="18" w:name="_RGI_28"/>
       <w:r>
         <w:t>6.1 Conclusions and Limitations</w:t>
       </w:r>
       <w:bookmarkEnd w:id="18"/>
+      <w:bookmarkEnd w:id="1018"/>
     </w:p>
     <w:p>
-      <w:r>
-        <w:t>RoadGuard connects visual perception, editable rules and evolutionary scheduling in an executable inspection-to-completion workflow. Human correction and revision checks preserve traceability. Modest recognition gains, improved seeded schedules and the pure-GA failure demonstrate both the value and limits of this integration.</w:t>
+      <w:pPr>
+        <w:spacing w:after="60"/>
+      </w:pPr>
+      <w:r>
+        <w:rPr>
+          <w:color w:val="000000"/>
+        </w:rPr>
+        <w:t>RoadGuard integrates perception, rules, evolutionary scheduling, grounded explanations and confirmed persistent adjustments. Human correction, citations and revision checks preserve traceability. Recognition gains, seeded schedules, the pure-GA failure and bounded assistant acceptance demonstrate its value and limits.</w:t>
       </w:r>
     </w:p>
     <w:p>
-      <w:r>
-        <w:t>Reused validation, one training seed, sparse subtypes, one task family and one Google snapshot limit generalisation. Service durations, shift/return policies and objective weights remain assumptions. No exact optimum, statistical significance or measured operational savings are established; independent local validation remains essential.</w:t>
+      <w:pPr>
+        <w:spacing w:after="60"/>
+      </w:pPr>
+      <w:r>
+        <w:rPr>
+          <w:color w:val="000000"/>
+        </w:rPr>
+        <w:t>Reused validation, one training seed, sparse subtypes, one task family and one Google snapshot limit generalisation. Service durations, shift/return policies and objective weights remain assumptions. Optimality, statistical significance and operational savings are unproven; independent local validation remains essential. Targeted checks establish neither universal semantic correctness nor the complete assistant suite; no broad user study exists.</w:t>
       </w:r>
     </w:p>
     <w:p>
       <w:pPr>
         <w:pStyle w:val="4"/>
         <w:pageBreakBefore w:val="0"/>
+        <w:spacing w:before="160" w:after="100"/>
         <w:jc w:val="left"/>
       </w:pPr>
+      <w:bookmarkStart w:id="1019" w:name="RGCurrentHeading19"/>
       <w:bookmarkStart w:id="19" w:name="_RGI_29"/>
       <w:r>
         <w:t>6.2 Future Work</w:t>
       </w:r>
       <w:bookmarkEnd w:id="19"/>
+      <w:bookmarkEnd w:id="1019"/>
     </w:p>
     <w:p>
-      <w:r>
-        <w:t>First, review subtype labels, missed potholes and disputed negatives, recording verified corrections. Add rare-class examples and hard negatives such as patches, wet surfaces, shadows, gravel and manholes. Use phone photographs at the intended moderate distance, retaining road context and all annotated objects while identifying the primary subject.</w:t>
+      <w:pPr>
+        <w:spacing w:after="60"/>
+      </w:pPr>
+      <w:r>
+        <w:rPr>
+          <w:color w:val="000000"/>
+        </w:rPr>
+        <w:t>Review subtype labels, missed potholes and disputed negatives, retaining verified corrections. Add rare classes and hard negatives: patches, wet surfaces, shadows, gravel and manholes. Collect moderate-distance phone photographs with road context, all-object annotations and an identified primary subject.</w:t>
       </w:r>
     </w:p>
     <w:p>
-      <w:r>
-        <w:t xml:space="preserve">Second, freeze an independently labelled local acceptance set, grouping the same location, defect and adjacent frames. Use only training/calibration data to compare sampling, context-preserving augmentation and class-specific calibration, then vary model size or resolution one factor at a time with repeated seeds and latency checks. Preserve recovery checkpoints. Report eight-class P/R, per-class misses, localisation and automatic-acceptance precision/review rate separately. </w:t>
+      <w:pPr>
+        <w:spacing w:after="60"/>
+      </w:pPr>
+      <w:r>
+        <w:rPr>
+          <w:color w:val="000000"/>
+        </w:rPr>
+        <w:t>Freeze an independently labelled local acceptance set grouped by location, defect and adjacent frames. Compare sampling, context-preserving augmentation and class calibration using training/calibration data only. Vary model size or resolution individually, with repeated seeds, latency checks and recovery checkpoints. Separately report eight-class P/R, class misses, localisation, automatic-acceptance precision and review rate. Precision and recall remain below 70%; improvements cannot guarantee these targets.</w:t>
       </w:r>
       <w:r>
         <w:rPr>
           <w:rFonts w:hint="eastAsia"/>
+          <w:color w:val="000000"/>
         </w:rPr>
-        <w:t>The targets of over 70% precision and recall have not yet been met, and the proposed improvements do not guarantee that these targets will be achieved.</w:t>
       </w:r>
       <w:bookmarkStart w:id="29" w:name="_GoBack"/>
       <w:bookmarkEnd w:id="29"/>
     </w:p>
     <w:p>
-      <w:r>
-        <w:t>Routing needs verified access, measured service durations, multiple travel periods, independent task sets and bounded or exact small-instance comparisons. Coordinated relocation could address the insertion failure. GPT/RAG requires grounded-answer, citation and confirmed-change evaluation.</w:t>
+      <w:pPr>
+        <w:spacing w:after="60"/>
+      </w:pPr>
+      <w:r>
+        <w:rPr>
+          <w:color w:val="000000"/>
+        </w:rPr>
+        <w:t>Routing needs verified access, measured service durations, varied travel periods, independent tasks and bounded/exact small-instance comparisons. Coordinated relocation could address insertion failure. GPT/RAG and confirmed adjustments need broader answer-quality, citation, multilingual-ambiguity and recovery evaluation, systematically covering the original questions and changes.</w:t>
       </w:r>
     </w:p>
     <w:p>
       <w:pPr>
-        <w:spacing w:before="200"/>
+        <w:spacing w:before="200" w:after="60" w:line="240" w:lineRule="auto"/>
       </w:pPr>
       <w:r>
-        <w:t>Acknowledgements. The group thanks the NUS-ISS teaching team for feedback on the project scope and crew allocation.</w:t>
+        <w:rPr>
+          <w:color w:val="000000"/>
+          <w:sz w:val="21"/>
+        </w:rPr>
+        <w:t>Acknowledgements. The group thanks the NUS-ISS teaching team for feedback on scope and crew allocation.</w:t>
       </w:r>
     </w:p>
     <w:p>
@@ -12223,304 +12682,559 @@
         <w:pageBreakBefore/>
         <w:jc w:val="left"/>
       </w:pPr>
+      <w:bookmarkStart w:id="1020" w:name="RGCurrentHeading20"/>
       <w:bookmarkStart w:id="20" w:name="_RGI_14"/>
       <w:r>
         <w:t>Appendix A Installation and User Guide</w:t>
       </w:r>
       <w:bookmarkEnd w:id="20"/>
+      <w:bookmarkEnd w:id="1020"/>
+    </w:p>
+    <w:p>
+      <w:pPr>
+        <w:jc w:val="left"/>
+      </w:pPr>
+      <w:r>
+        <w:rPr>
+          <w:color w:val="000000"/>
+        </w:rPr>
+        <w:t>This guide covers local installation, the inspection-to-completion workflow and dispatcher assistant. The final report reproduces this complete guide in Appendix A. Local acceptance used Windows, Python 3.12.14 and Node 22.23.3. Independent installation on a clean machine has not been validated.</w:t>
+      </w:r>
     </w:p>
     <w:p>
       <w:pPr>
         <w:pStyle w:val="4"/>
-        <w:pageBreakBefore w:val="0"/>
-        <w:jc w:val="left"/>
       </w:pPr>
-      <w:bookmarkStart w:id="21" w:name="_RGI_15"/>
-      <w:r>
-        <w:t>A.1 Environment and Dependencies</w:t>
-      </w:r>
-      <w:bookmarkEnd w:id="21"/>
+      <w:bookmarkStart w:id="1021" w:name="RGCurrentHeading21"/>
+      <w:r>
+        <w:rPr>
+          <w:color w:val="000000"/>
+        </w:rPr>
+        <w:t>A.1 Environment and dependencies</w:t>
+      </w:r>
+      <w:bookmarkEnd w:id="1021"/>
     </w:p>
     <w:p>
       <w:pPr>
-        <w:jc w:val="both"/>
+        <w:jc w:val="left"/>
       </w:pPr>
       <w:r>
-        <w:t>Use Python 3.12 for the full application: pinned NumPy 2.5.2 requires Python 3.12 or later. Local acceptance used Windows, Python 3.12.14 and Node 22.23.3; Python 3.11 CI excludes vision dependencies. The frontend requires Node 22.x (22.12 or later) and npm 10 or later. Clone the private repository with authorised GitHub access and run these PowerShell commands from its root. The approved YOLO weight is included in SystemCode/backend/roadguard/model/; Dataset downloads are not required for inference.</w:t>
+        <w:rPr>
+          <w:color w:val="000000"/>
+        </w:rPr>
+        <w:t>Use Python 3.12 for the full application: the pinned numpy==2.5.2 requires Python &gt;=3.12. Base CI uses Python 3.11 without installing the optional vision dependency set, so its success is not evidence that vision runs on 3.11. Use Node 22.x &gt;=22.12 and npm &gt;=10.</w:t>
+      </w:r>
+    </w:p>
+    <w:p>
+      <w:pPr>
+        <w:jc w:val="left"/>
+      </w:pPr>
+      <w:r>
+        <w:rPr>
+          <w:color w:val="000000"/>
+        </w:rPr>
+        <w:t>Clone the private repository with authorised access. The approved YOLO checkpoint is included in SystemCode/backend/roadguard/model/; Dataset is not required for inference. From the repository root, create a new environment on first use:</w:t>
       </w:r>
     </w:p>
     <w:p>
       <w:pPr>
         <w:pStyle w:val="167"/>
-        <w:keepLines/>
-        <w:spacing w:line="288" w:lineRule="auto"/>
         <w:jc w:val="left"/>
       </w:pPr>
       <w:r>
+        <w:rPr>
+          <w:color w:val="000000"/>
+        </w:rPr>
         <w:t>py -3.12 -m venv .venv</w:t>
-      </w:r>
-      <w:r>
-        <w:br w:type="textWrapping"/>
-      </w:r>
-      <w:r>
+        <w:br/>
         <w:t>.\.venv\Scripts\python.exe -m pip install -r SystemCode/backend/requirements-ci.txt</w:t>
-      </w:r>
-      <w:r>
-        <w:br w:type="textWrapping"/>
-      </w:r>
-      <w:r>
+        <w:br/>
         <w:t>.\.venv\Scripts\python.exe -m pip install -r SystemCode/model/requirements-vision.txt</w:t>
       </w:r>
     </w:p>
     <w:p>
       <w:pPr>
-        <w:jc w:val="both"/>
+        <w:jc w:val="left"/>
       </w:pPr>
       <w:r>
-        <w:t>The pinned vision requirements include PyTorch, torchvision and Ultralytics. CPU inference was exercised during local acceptance. GPU training has separate CUDA requirements and is not needed for inference. Installation on a fresh machine has not been independently validated.</w:t>
+        <w:rPr>
+          <w:color w:val="000000"/>
+        </w:rPr>
+        <w:t>If an existing .venv uses another Python version, create a separate Python 3.12 environment and substitute its path in all commands. Do not recreate an environment while it is in use. CPU inference is supported by the recorded local acceptance; GPU training has separate CUDA requirements.</w:t>
       </w:r>
     </w:p>
     <w:p>
       <w:pPr>
         <w:pStyle w:val="4"/>
-        <w:pageBreakBefore w:val="0"/>
-        <w:jc w:val="left"/>
       </w:pPr>
-      <w:bookmarkStart w:id="22" w:name="_RGI_16"/>
-      <w:r>
-        <w:t>A.2 Accounts and Local Configuration</w:t>
-      </w:r>
-      <w:bookmarkEnd w:id="22"/>
+      <w:bookmarkStart w:id="1022" w:name="RGCurrentHeading22"/>
+      <w:r>
+        <w:rPr>
+          <w:color w:val="000000"/>
+        </w:rPr>
+        <w:t>A.2 Local retrieval and optional GPT configuration</w:t>
+      </w:r>
+      <w:bookmarkEnd w:id="1022"/>
     </w:p>
     <w:p>
       <w:pPr>
-        <w:jc w:val="both"/>
+        <w:jc w:val="left"/>
       </w:pPr>
       <w:r>
-        <w:t>No default accounts or shared passwords are shipped. Create an inspector, dispatcher and crew accounts in the same database used by the server. Each command prompts privately for a 12–256-character password. If ROADGUARD_DB_PATH is customised, keep its value identical in provisioning and server terminals.</w:t>
+        <w:rPr>
+          <w:color w:val="000000"/>
+        </w:rPr>
+        <w:t>Install the full backend requirements and prepare the reviewed local knowledge index before using evidence questions. Run these commands from the repository root after creating the Python 3.12 environment:</w:t>
       </w:r>
     </w:p>
     <w:p>
       <w:pPr>
         <w:pStyle w:val="167"/>
-        <w:keepLines/>
-        <w:spacing w:line="288" w:lineRule="auto"/>
         <w:jc w:val="left"/>
       </w:pPr>
       <w:r>
+        <w:rPr>
+          <w:color w:val="000000"/>
+        </w:rPr>
+        <w:t>.\.venv\Scripts\python.exe -m pip install -r SystemCode/backend/requirements.txt</w:t>
+        <w:br/>
         <w:t>$env:PYTHONPATH = 'SystemCode/backend'</w:t>
-      </w:r>
-      <w:r>
-        <w:br w:type="textWrapping"/>
-      </w:r>
-      <w:r>
-        <w:t>.\.venv\Scripts\python.exe -m roadguard.auth.manage create inspector --role inspector</w:t>
-      </w:r>
-      <w:r>
-        <w:br w:type="textWrapping"/>
-      </w:r>
-      <w:r>
-        <w:t>.\.venv\Scripts\python.exe -m roadguard.auth.manage create dispatcher --role dispatcher</w:t>
-      </w:r>
-      <w:r>
-        <w:br w:type="textWrapping"/>
-      </w:r>
-      <w:r>
-        <w:t>.\.venv\Scripts\python.exe -m roadguard.auth.manage create crew02 --role crew --crew crew-02</w:t>
+        <w:br/>
+        <w:t>.\.venv\Scripts\python.exe -m roadguard.assistant.index_knowledge --download-model</w:t>
       </w:r>
     </w:p>
     <w:p>
       <w:pPr>
-        <w:jc w:val="both"/>
+        <w:jc w:val="left"/>
       </w:pPr>
       <w:r>
-        <w:t>Repeat the crew command with distinct usernames and crew-01, crew-03 and crew-04 when those workspaces are needed. Accounts are local database records and are not shared by pulling Git. The default database is SystemCode/backend/data/roadguard.sqlite3. Preserve it and its adjacent uploads directory together.</w:t>
+        <w:rPr>
+          <w:color w:val="000000"/>
+        </w:rPr>
+        <w:t>First setup downloads approximately 487 MB of pinned multilingual-e5-small model/tokenizer files and verifies their hashes. The encoder uses ONNX Runtime on CPU; it does not call an embedding API or change the YOLO model. Subsequent setup reuses verified files. After pulling a reviewed knowledge update, rebuild the current index with .\.venv\Scripts\python.exe -m roadguard.assistant.index_knowledge and restart the backend. HTTP requests never download models or rebuild indexes. The current package is a-knowledge-v17; Chroma collections are versioned against the manifest, encoder and chunking policy.</w:t>
+      </w:r>
+    </w:p>
+    <w:p>
+      <w:pPr>
+        <w:jc w:val="left"/>
+      </w:pPr>
+      <w:r>
+        <w:rPr>
+          <w:color w:val="000000"/>
+        </w:rPr>
+        <w:t>The default Chroma path is SystemCode/backend/data/rag/chroma/; embedding files are under SystemCode/backend/data/rag/models/multilingual-e5-small/. Both are ignored local runtime storage. Server-side overrides are ROADGUARD_CHROMA_PATH and ROADGUARD_EMBEDDING_PATH. Dataset, uploads, account records and business databases are not indexed. Retrieval uses cosine similarity, whose score is not answer correctness. See the vector retrieval guide (../SystemCode/backend/roadguard/assistant/VECTOR_RETRIEVAL.md).</w:t>
+      </w:r>
+    </w:p>
+    <w:p>
+      <w:pPr>
+        <w:jc w:val="left"/>
+      </w:pPr>
+      <w:r>
+        <w:rPr>
+          <w:color w:val="000000"/>
+        </w:rPr>
+        <w:t>GPT generation is disabled by default. To enable it, set these variables privately in the backend terminal before startup:</w:t>
+      </w:r>
+    </w:p>
+    <w:p>
+      <w:pPr>
+        <w:pStyle w:val="167"/>
+        <w:jc w:val="left"/>
+      </w:pPr>
+      <w:r>
+        <w:rPr>
+          <w:color w:val="000000"/>
+        </w:rPr>
+        <w:t>$env:ROADGUARD_ASSISTANT_ENABLED = 'true'</w:t>
+        <w:br/>
+        <w:t>$env:ROADGUARD_ASSISTANT_MODEL = 'gpt-4.1-mini'</w:t>
+        <w:br/>
+        <w:t>$privateKey = Read-Host 'OpenAI API key' -AsSecureString</w:t>
+        <w:br/>
+        <w:t>$env:OPENAI_API_KEY = [System.Net.NetworkCredential]::new('', $privateKey).Password</w:t>
+        <w:br/>
+        <w:t>Remove-Variable privateKey</w:t>
+      </w:r>
+    </w:p>
+    <w:p>
+      <w:pPr>
+        <w:jc w:val="left"/>
+      </w:pPr>
+      <w:r>
+        <w:rPr>
+          <w:color w:val="000000"/>
+        </w:rPr>
+        <w:t>gpt-4.1-mini is the model used in the recorded targeted acceptance; select only a model available to your account. The enabled flag accepts exactly lowercase true or false; uppercase True is invalid. Restart the backend after changing environment settings. Never place the key in frontend code, Git or the report. The status endpoint reports non-secret configuration and usage, not credential validity. Optional limits are ROADGUARD_ASSISTANT_MAX_OUTPUT_TOKENS (default 1200, range 256–2000) and ROADGUARD_ASSISTANT_MAX_CALLS (default 20 per process, range 1–200). Attempted calls, including failures, consume the local budget; it resets on restart and is not an account-wide spending cap. Real provider requests may incur charges. There are no automatic retries or model fallbacks.</w:t>
       </w:r>
     </w:p>
     <w:p>
       <w:pPr>
         <w:pStyle w:val="4"/>
-        <w:pageBreakBefore w:val="0"/>
+      </w:pPr>
+      <w:bookmarkStart w:id="1023" w:name="RGCurrentHeading23"/>
+      <w:r>
+        <w:rPr>
+          <w:color w:val="000000"/>
+        </w:rPr>
+        <w:t>A.3 Accounts and data</w:t>
+      </w:r>
+      <w:bookmarkEnd w:id="1023"/>
+    </w:p>
+    <w:p>
+      <w:pPr>
         <w:jc w:val="left"/>
       </w:pPr>
-      <w:bookmarkStart w:id="23" w:name="_RGI_17"/>
-      <w:r>
-        <w:t>A.3 Starting the Application</w:t>
-      </w:r>
-      <w:bookmarkEnd w:id="23"/>
+      <w:r>
+        <w:rPr>
+          <w:color w:val="000000"/>
+        </w:rPr>
+        <w:t>No default accounts or shared passwords are shipped. Provision accounts in the same database used by the server; each command privately prompts for a 12–256-character password:</w:t>
+      </w:r>
     </w:p>
     <w:p>
       <w:pPr>
         <w:pStyle w:val="167"/>
-        <w:keepLines/>
-        <w:spacing w:line="288" w:lineRule="auto"/>
         <w:jc w:val="left"/>
       </w:pPr>
       <w:r>
-        <w:t>$env:ROADGUARD_TRAVEL_MATRIX_PROVIDER = 'simulated'</w:t>
-      </w:r>
-      <w:r>
-        <w:br w:type="textWrapping"/>
-      </w:r>
-      <w:r>
-        <w:t>.\.venv\Scripts\python.exe -m uvicorn roadguard.main:app `</w:t>
-      </w:r>
-      <w:r>
-        <w:br w:type="textWrapping"/>
-      </w:r>
-      <w:r>
-        <w:t xml:space="preserve"> --app-dir SystemCode/backend --host 127.0.0.1 --port 8000</w:t>
+        <w:rPr>
+          <w:color w:val="000000"/>
+        </w:rPr>
+        <w:t>$env:PYTHONPATH = 'SystemCode/backend'</w:t>
+        <w:br/>
+        <w:t>.\.venv\Scripts\python.exe -m roadguard.auth.manage create inspector --role inspector</w:t>
+        <w:br/>
+        <w:t>.\.venv\Scripts\python.exe -m roadguard.auth.manage create dispatcher --role dispatcher</w:t>
+        <w:br/>
+        <w:t>.\.venv\Scripts\python.exe -m roadguard.auth.manage create crew02 --role crew --crew crew-02</w:t>
       </w:r>
     </w:p>
     <w:p>
       <w:pPr>
-        <w:keepNext/>
-        <w:jc w:val="both"/>
+        <w:jc w:val="left"/>
       </w:pPr>
       <w:r>
-        <w:t>Open a second terminal at the repository root:</w:t>
+        <w:rPr>
+          <w:color w:val="000000"/>
+        </w:rPr>
+        <w:t>Provision distinct usernames for crew-01, crew-03 and crew-04 when needed. Crew identity is fixed by the account. Accounts and passwords are local database records, not shared through Git. The default database is SystemCode/backend/data/roadguard.sqlite3; back it up with its adjacent uploads directory. If ROADGUARD_DB_PATH is customised, use the same value when provisioning accounts and starting the server. See account roles (../Miscellaneous/ACCOUNT_ROLES.md).</w:t>
+      </w:r>
+    </w:p>
+    <w:p>
+      <w:pPr>
+        <w:pStyle w:val="4"/>
+      </w:pPr>
+      <w:bookmarkStart w:id="1024" w:name="RGCurrentHeading24"/>
+      <w:r>
+        <w:rPr>
+          <w:color w:val="000000"/>
+        </w:rPr>
+        <w:t>A.4 Start the application</w:t>
+      </w:r>
+      <w:bookmarkEnd w:id="1024"/>
+    </w:p>
+    <w:p>
+      <w:pPr>
+        <w:jc w:val="left"/>
+      </w:pPr>
+      <w:r>
+        <w:rPr>
+          <w:color w:val="000000"/>
+        </w:rPr>
+        <w:t>Backend, from the repository root:</w:t>
       </w:r>
     </w:p>
     <w:p>
       <w:pPr>
         <w:pStyle w:val="167"/>
-        <w:keepLines/>
-        <w:spacing w:line="288" w:lineRule="auto"/>
         <w:jc w:val="left"/>
       </w:pPr>
       <w:r>
-        <w:t>cd SystemCode/frontend</w:t>
-      </w:r>
-      <w:r>
-        <w:br w:type="textWrapping"/>
-      </w:r>
-      <w:r>
-        <w:t>npm ci</w:t>
-      </w:r>
-      <w:r>
-        <w:br w:type="textWrapping"/>
-      </w:r>
-      <w:r>
-        <w:t>$env:ROADGUARD_API_TARGET = 'http://127.0.0.1:8000'</w:t>
-      </w:r>
-      <w:r>
-        <w:br w:type="textWrapping"/>
-      </w:r>
-      <w:r>
-        <w:t>npm run dev</w:t>
+        <w:rPr>
+          <w:color w:val="000000"/>
+        </w:rPr>
+        <w:t>$env:ROADGUARD_TRAVEL_MATRIX_PROVIDER = 'simulated'</w:t>
+        <w:br/>
+        <w:t>.\.venv\Scripts\python.exe -m uvicorn roadguard.main:app --app-dir SystemCode/backend --host 127.0.0.1 --port 8000</w:t>
       </w:r>
     </w:p>
     <w:p>
       <w:pPr>
-        <w:jc w:val="both"/>
+        <w:jc w:val="left"/>
       </w:pPr>
       <w:r>
-        <w:t>Open http://127.0.0.1:5173 and sign in. API documentation is at http://127.0.0.1:8000/docs and the public health endpoint is /api/v1/health. Health confirms application/database access only. The model loads lazily on real inference; stop the relevant terminal with Ctrl+C. Do not start a duplicate server on an occupied port.</w:t>
+        <w:rPr>
+          <w:color w:val="000000"/>
+        </w:rPr>
+        <w:t>In a second terminal, from the repository root:</w:t>
+      </w:r>
+    </w:p>
+    <w:p>
+      <w:pPr>
+        <w:pStyle w:val="167"/>
+        <w:jc w:val="left"/>
+      </w:pPr>
+      <w:r>
+        <w:rPr>
+          <w:color w:val="000000"/>
+        </w:rPr>
+        <w:t>cd SystemCode/frontend</w:t>
+        <w:br/>
+        <w:t>npm ci</w:t>
+        <w:br/>
+        <w:t>$env:ROADGUARD_API_TARGET = 'http://127.0.0.1:8000'</w:t>
+        <w:br/>
+        <w:t>npm run dev</w:t>
+      </w:r>
+    </w:p>
+    <w:p>
+      <w:pPr>
+        <w:jc w:val="left"/>
+      </w:pPr>
+      <w:r>
+        <w:rPr>
+          <w:color w:val="000000"/>
+        </w:rPr>
+        <w:t>Open http://127.0.0.1:5173 and sign in. API documentation is at http://127.0.0.1:8000/docs; the public health endpoint is /api/v1/health. Health checks application/database access only, and the model loads lazily on real inference. Stop the appropriate terminal with Ctrl+C. Do not start duplicate servers on occupied ports.</w:t>
       </w:r>
     </w:p>
     <w:p>
       <w:pPr>
         <w:pStyle w:val="4"/>
-        <w:pageBreakBefore w:val="0"/>
-        <w:jc w:val="left"/>
       </w:pPr>
-      <w:bookmarkStart w:id="24" w:name="_RGI_18"/>
-      <w:r>
-        <w:t>A.4 User Workflow</w:t>
-      </w:r>
-      <w:bookmarkEnd w:id="24"/>
+      <w:bookmarkStart w:id="1025" w:name="RGCurrentHeading25"/>
+      <w:r>
+        <w:rPr>
+          <w:color w:val="000000"/>
+        </w:rPr>
+        <w:t>A.5 User workflow</w:t>
+      </w:r>
+      <w:bookmarkEnd w:id="1025"/>
     </w:p>
     <w:p>
       <w:pPr>
-        <w:jc w:val="both"/>
+        <w:jc w:val="left"/>
       </w:pPr>
       <w:r>
-        <w:t>1. Sign in as an inspector and open the upload page. Select a JPEG or PNG within 8 MiB and 20 megapixels. Choose real mode for model inference, enter a Jurong position and declare the road type. A test coordinate such as latitude 1.3405 and longitude 103.706 is synthetic unless it is the image’s verified location.</w:t>
+        <w:rPr>
+          <w:color w:val="000000"/>
+        </w:rPr>
+        <w:t>1. Sign in as an inspector. Upload a JPEG or PNG within 8 MiB and 20 megapixels, choose real inference or an explicit synthetic scenario, enter Jurong coordinates and declare road type. Coordinates such as 1.3405, 103.706 are synthetic unless verified as the photo's location.</w:t>
       </w:r>
     </w:p>
     <w:p>
       <w:pPr>
-        <w:jc w:val="both"/>
+        <w:jc w:val="left"/>
       </w:pPr>
       <w:r>
-        <w:t>2. Submit and inspect the result. Upload returns inspection_id, status, detection and task_id. A detection is one object or null. Inspect the detail page for provenance and rule information. A primary raw confidence of at least 0.60 automatically creates one task; a lower-confidence result waits for review; no detection creates no task.</w:t>
+        <w:rPr>
+          <w:color w:val="000000"/>
+        </w:rPr>
+        <w:t>2. Inspect the result. Upload returns inspection_id, status, one detection or null, and task_id. Real primary raw confidence &gt;=0.60 creates one task; lower confidence requires review, and no detection creates no task. Raw evidence and frozen rules remain available in inspection details.</w:t>
       </w:r>
     </w:p>
     <w:p>
       <w:pPr>
-        <w:jc w:val="both"/>
+        <w:jc w:val="left"/>
       </w:pPr>
       <w:r>
-        <w:t>3. Sign in as the dispatcher. In the review queue, confirm, correct or reject pending evidence. Correcting a label reapplies its stored rules. Accepted work appears in tasks with priority and service minutes. Completion or cancellation retains history while removing it from active planning inputs.</w:t>
+        <w:rPr>
+          <w:color w:val="000000"/>
+        </w:rPr>
+        <w:t>3. Sign in as the dispatcher. Confirm, correct or reject pending inspections; corrections use stored rules. Accepted tasks contain the demonstration priority and service duration. Completed/cancelled records retain history and leave the active planning snapshot.</w:t>
       </w:r>
     </w:p>
     <w:p>
       <w:pPr>
-        <w:jc w:val="both"/>
+        <w:jc w:val="left"/>
       </w:pPr>
       <w:r>
-        <w:t>4. Review four-crew availability and explicitly recalculate from the routes page. Both planners use the current snapshot. Inspect unassigned tasks and reasons, then open the same-round comparison. A stale warning means inputs have changed; do not interpret the old plan as current.</w:t>
+        <w:rPr>
+          <w:color w:val="000000"/>
+        </w:rPr>
+        <w:t>4. Check crew availability and explicitly recalculate. Both planners use the same snapshot and matrix. Inspect unassigned reasons and the same-round comparison. Changes make existing plans stale; they do not trigger automatic recalculation.</w:t>
       </w:r>
     </w:p>
     <w:p>
       <w:pPr>
-        <w:jc w:val="both"/>
+        <w:jc w:val="left"/>
       </w:pPr>
       <w:r>
-        <w:t>5. Identify the crew assigned to a task in the latest GA plan, then sign in with an account provisioned for that crew. The example crew02 account can complete only Crew 02 tasks and may be idle. View the assigned task and confirm completion. The server checks assignment and task version. Completion changes the planning input; a dispatcher must explicitly replan. The route-assistant page remains a placeholder.</w:t>
+        <w:rPr>
+          <w:color w:val="000000"/>
+        </w:rPr>
+        <w:t>5. Sign in as the crew assigned by the latest saved GA plan. View and complete that crew's tasks; the server checks current assignment and task version. Completion changes planning inputs, and dispatch must explicitly replan.</w:t>
+      </w:r>
+    </w:p>
+    <w:p>
+      <w:pPr>
+        <w:jc w:val="left"/>
+      </w:pPr>
+      <w:r>
+        <w:rPr>
+          <w:color w:val="000000"/>
+        </w:rPr>
+        <w:t>The frontend map shows schematic stop order, not turn-by-turn navigation. See the frontend guide (../SystemCode/frontend/README.md).</w:t>
       </w:r>
     </w:p>
     <w:p>
       <w:pPr>
         <w:pStyle w:val="4"/>
-        <w:pageBreakBefore w:val="0"/>
-        <w:jc w:val="left"/>
       </w:pPr>
-      <w:bookmarkStart w:id="25" w:name="_RGI_19"/>
-      <w:r>
-        <w:t>A.5 API Testing and Troubleshooting</w:t>
-      </w:r>
-      <w:bookmarkEnd w:id="25"/>
+      <w:bookmarkStart w:id="1026" w:name="RGCurrentHeading26"/>
+      <w:r>
+        <w:rPr>
+          <w:color w:val="000000"/>
+        </w:rPr>
+        <w:t>A.6 Dispatcher evidence questions</w:t>
+      </w:r>
+      <w:bookmarkEnd w:id="1026"/>
     </w:p>
     <w:p>
       <w:pPr>
-        <w:jc w:val="both"/>
+        <w:jc w:val="left"/>
       </w:pPr>
       <w:r>
-        <w:t>For Swagger, first call POST /api/v1/auth/login with a provisioned username and password. Retain the same host name so the browser keeps the session cookie; copy the returned csrf_token into X-CSRF-Token for modifying requests. GET requests do not require CSRF. Upload uses multipart image plus metadata. Give each new upload a new Idempotency-Key; retry a lost response with the identical image, metadata and same key. A changed payload requires a new submission.</w:t>
+        <w:rPr>
+          <w:color w:val="000000"/>
+        </w:rPr>
+        <w:t>Sign in as a dispatcher and open Route assistant. Ask about a supported repair rule or project operation, or select an explicit saved plan for route questions. Saved-plan answers use authorized persisted facts rather than browser-supplied totals. English and bounded Chinese question aliases are supported; generated answers and the interface are English.</w:t>
       </w:r>
     </w:p>
     <w:p>
       <w:pPr>
-        <w:pStyle w:val="167"/>
-        <w:keepLines/>
-        <w:spacing w:line="288" w:lineRule="auto"/>
         <w:jc w:val="left"/>
       </w:pPr>
       <w:r>
-        <w:t>{"mode":"real","latitude":1.3405,"longitude":103.706,</w:t>
-      </w:r>
-      <w:r>
-        <w:br w:type="textWrapping"/>
-      </w:r>
-      <w:r>
-        <w:t xml:space="preserve"> "road_type":"public_motor_road"}</w:t>
+        <w:rPr>
+          <w:color w:val="000000"/>
+        </w:rPr>
+        <w:t>Read the answer first. Sources are closed by default; expand View sources to inspect exact quotations, citation IDs, package/version hashes and saved-plan provenance. The query-v3 grounded_summary mode uses local Chroma/E5 retrieval and one optional GPT call. GPT chooses server-owned evidence IDs; the server restores exact quotations and required context. Canonical repair answers are rendered from the matching rule rows, preserving demonstration qualifiers. Number, priority, identifier, label, source and plan checks reject unsupported output. These bounded checks do not establish universal semantic correctness.</w:t>
+      </w:r>
+    </w:p>
+    <w:p>
+      <w:pPr>
+        <w:jc w:val="left"/>
+      </w:pPr>
+      <w:r>
+        <w:rPr>
+          <w:color w:val="000000"/>
+        </w:rPr>
+        <w:t>A standalone question such as “What model are you?” returns the configured model name using server_configuration, without GPT, retrieval or saved-plan reads. It remains usable when generation is disabled or the key is missing. It identifies configuration, not proof of provider execution or the separate YOLO detector. Clearly unrelated questions return scope_guidance with RoadGuard examples. These direct modes have no citations or knowledge-package metadata and consume no model-call budget. Ambiguous or mixed domain questions retain the evidence flow; insufficient evidence and validation failures remain explicit.</w:t>
+      </w:r>
+    </w:p>
+    <w:p>
+      <w:pPr>
+        <w:jc w:val="left"/>
+      </w:pPr>
+      <w:r>
+        <w:rPr>
+          <w:color w:val="000000"/>
+        </w:rPr>
+        <w:t>Queries do not change tasks, crew availability or routes. A model answer never authorizes a business action.</w:t>
+      </w:r>
+    </w:p>
+    <w:p>
+      <w:pPr>
+        <w:pStyle w:val="4"/>
+      </w:pPr>
+      <w:bookmarkStart w:id="1027" w:name="RGCurrentHeading27"/>
+      <w:r>
+        <w:rPr>
+          <w:color w:val="000000"/>
+        </w:rPr>
+        <w:t>A.7 Dispatcher route previews and confirmed adjustments</w:t>
+      </w:r>
+      <w:bookmarkEnd w:id="1027"/>
+    </w:p>
+    <w:p>
+      <w:pPr>
+        <w:jc w:val="left"/>
+      </w:pPr>
+      <w:r>
+        <w:rPr>
+          <w:color w:val="000000"/>
+        </w:rPr>
+        <w:t>Open Crew adjustments in Route assistant and load a saved plan ID or the latest GA plan. Four crew cards show stop order, travel, service, required return travel, total work, remaining shift and persistent assignment badges. Use a current plan for changes. Crew availability changes remain a separate preview and confirmation workflow.</w:t>
+      </w:r>
+    </w:p>
+    <w:p>
+      <w:pPr>
+        <w:jc w:val="left"/>
+      </w:pPr>
+      <w:r>
+        <w:rPr>
+          <w:color w:val="000000"/>
+        </w:rPr>
+        <w:t>To move a task, select an assigned active task and a different available crew, then preview. Inspect before/after routes and acknowledge the preview before confirming. The server retains all other assigned work and checks travel plus service plus configured depot return against the shift limit (480 minutes in the routing demo). Unknown travel, infeasible work, stale input/configuration or expired previews are rejected without mutation. A rejected move never silently drops another task.</w:t>
+      </w:r>
+    </w:p>
+    <w:p>
+      <w:pPr>
+        <w:jc w:val="left"/>
+      </w:pPr>
+      <w:r>
+        <w:rPr>
+          <w:color w:val="000000"/>
+        </w:rPr>
+        <w:t>Confirmation stores a durable task-to-crew constraint; it does not save a new route automatically. Choose Recalculate saved task change and reload the latest GA plan. Both Greedy and GA retain the constraint after restart and when new tasks are added. Stop order may change. Unavailable or infeasible constrained tasks are reported as unassigned instead of silently changing crews. The shift and return policies remain configurable demonstration assumptions.</w:t>
+      </w:r>
+    </w:p>
+    <w:p>
+      <w:pPr>
+        <w:jc w:val="left"/>
+      </w:pPr>
+      <w:r>
+        <w:rPr>
+          <w:color w:val="000000"/>
+        </w:rPr>
+        <w:t>To cancel work, choose Cancel active task, preview and explicitly confirm. Assigned and unassigned active tasks can be cancelled. Cancellation retains task/history records and removes the task from active planning; explicitly recalculate to replace stale routes. Completed and cancelled tasks cannot be reopened. Discard task preview closes only an unconfirmed proposal and does not cancel a task. Use recent records or the change ID to recover after interruption; refresh before retrying a version conflict. Confirm/replan retries are bounded and idempotent.</w:t>
+      </w:r>
+    </w:p>
+    <w:p>
+      <w:pPr>
+        <w:jc w:val="left"/>
+      </w:pPr>
+      <w:r>
+        <w:rPr>
+          <w:color w:val="000000"/>
+        </w:rPr>
+        <w:t>Reassignment immediately removes the previous crew's task/inspection read and completion access. The target crew waits for an explicit saved GA recalculation. An affected old route is omitted with a stale/recalculation explanation. Crew and inspector accounts cannot perform dispatcher adjustment operations. These checks apply in the backend as well as the interface.</w:t>
+      </w:r>
+    </w:p>
+    <w:p>
+      <w:pPr>
+        <w:pStyle w:val="4"/>
+      </w:pPr>
+      <w:bookmarkStart w:id="1028" w:name="RGCurrentHeading28"/>
+      <w:r>
+        <w:rPr>
+          <w:color w:val="000000"/>
+        </w:rPr>
+        <w:t>A.8 API testing and troubleshooting</w:t>
+      </w:r>
+      <w:bookmarkEnd w:id="1028"/>
+    </w:p>
+    <w:p>
+      <w:pPr>
+        <w:jc w:val="left"/>
+      </w:pPr>
+      <w:r>
+        <w:rPr>
+          <w:color w:val="000000"/>
+        </w:rPr>
+        <w:t>In Swagger, call POST /api/v1/auth/login with a provisioned account. Keep the same host name for session cookies, and send the returned csrf_token as X-CSRF-Token for authenticated modifying requests. Upload uses multipart image and metadata, with a new Idempotency-Key for each new submission. Retry a lost response with identical content and the same key.</w:t>
       </w:r>
     </w:p>
     <w:p>
       <w:pPr>
         <w:pStyle w:val="164"/>
-        <w:keepNext/>
-        <w:jc w:val="left"/>
       </w:pPr>
       <w:r>
         <w:rPr>
-          <w:b/>
+          <w:color w:val="000000"/>
         </w:rPr>
-        <w:t xml:space="preserve">Table A1. </w:t>
-      </w:r>
-      <w:r>
-        <w:t>Common issues</w:t>
+        <w:t>Table A1. Common issues</w:t>
       </w:r>
     </w:p>
     <w:tbl>
@@ -12535,84 +13249,56 @@
           <w:bottom w:w="0" w:type="dxa"/>
           <w:right w:w="108" w:type="dxa"/>
         </w:tblCellMar>
+        <w:tblBorders>
+          <w:top w:val="single" w:sz="4" w:color="D9D9D9"/>
+          <w:left w:val="single" w:sz="4" w:color="D9D9D9"/>
+          <w:bottom w:val="single" w:sz="4" w:color="D9D9D9"/>
+          <w:right w:val="single" w:sz="4" w:color="D9D9D9"/>
+          <w:insideH w:val="single" w:sz="4" w:color="D9D9D9"/>
+          <w:insideV w:val="single" w:sz="4" w:color="D9D9D9"/>
+        </w:tblBorders>
       </w:tblPr>
       <w:tblGrid>
         <w:gridCol w:w="2375"/>
         <w:gridCol w:w="6985"/>
       </w:tblGrid>
       <w:tr>
-        <w:tblPrEx>
-          <w:tblCellMar>
-            <w:top w:w="0" w:type="dxa"/>
-            <w:left w:w="108" w:type="dxa"/>
-            <w:bottom w:w="0" w:type="dxa"/>
-            <w:right w:w="108" w:type="dxa"/>
-          </w:tblCellMar>
-        </w:tblPrEx>
         <w:trPr>
           <w:cantSplit/>
           <w:tblHeader/>
         </w:trPr>
         <w:tc>
           <w:tcPr>
-            <w:tcW w:w="2375" w:type="dxa"/>
-            <w:tcBorders>
-              <w:top w:val="single" w:color="D9D9D9" w:sz="4" w:space="0"/>
-              <w:left w:val="single" w:color="D9D9D9" w:sz="4" w:space="0"/>
-              <w:bottom w:val="single" w:color="D9D9D9" w:sz="4" w:space="0"/>
-              <w:right w:val="single" w:color="D9D9D9" w:sz="4" w:space="0"/>
-            </w:tcBorders>
-            <w:shd w:val="clear" w:color="auto" w:fill="EAEAEA"/>
-            <w:tcMar>
-              <w:top w:w="75" w:type="dxa"/>
-              <w:left w:w="90" w:type="dxa"/>
-              <w:bottom w:w="75" w:type="dxa"/>
-              <w:right w:w="90" w:type="dxa"/>
-            </w:tcMar>
-            <w:vAlign w:val="center"/>
-          </w:tcPr>
-          <w:p>
-            <w:pPr>
-              <w:spacing w:after="40" w:line="264" w:lineRule="auto"/>
+            <w:tcW w:type="dxa" w:w="2375"/>
+            <w:shd w:fill="EAEAEA"/>
+          </w:tcPr>
+          <w:p>
+            <w:pPr>
+              <w:spacing w:after="60" w:before="60" w:line="240" w:lineRule="auto"/>
               <w:jc w:val="left"/>
             </w:pPr>
             <w:r>
               <w:rPr>
-                <w:rFonts w:ascii="Times New Roman" w:hAnsi="Times New Roman"/>
                 <w:b/>
                 <w:color w:val="000000"/>
                 <w:sz w:val="21"/>
               </w:rPr>
-              <w:t>Symptom</w:t>
-            </w:r>
-          </w:p>
-        </w:tc>
-        <w:tc>
-          <w:tcPr>
-            <w:tcW w:w="6985" w:type="dxa"/>
-            <w:tcBorders>
-              <w:top w:val="single" w:color="D9D9D9" w:sz="4" w:space="0"/>
-              <w:left w:val="single" w:color="D9D9D9" w:sz="4" w:space="0"/>
-              <w:bottom w:val="single" w:color="D9D9D9" w:sz="4" w:space="0"/>
-              <w:right w:val="single" w:color="D9D9D9" w:sz="4" w:space="0"/>
-            </w:tcBorders>
-            <w:shd w:val="clear" w:color="auto" w:fill="EAEAEA"/>
-            <w:tcMar>
-              <w:top w:w="75" w:type="dxa"/>
-              <w:left w:w="90" w:type="dxa"/>
-              <w:bottom w:w="75" w:type="dxa"/>
-              <w:right w:w="90" w:type="dxa"/>
-            </w:tcMar>
-            <w:vAlign w:val="center"/>
-          </w:tcPr>
-          <w:p>
-            <w:pPr>
-              <w:spacing w:after="40" w:line="264" w:lineRule="auto"/>
+              <w:t>Issue</w:t>
+            </w:r>
+          </w:p>
+        </w:tc>
+        <w:tc>
+          <w:tcPr>
+            <w:tcW w:type="dxa" w:w="6985"/>
+            <w:shd w:fill="EAEAEA"/>
+          </w:tcPr>
+          <w:p>
+            <w:pPr>
+              <w:spacing w:after="60" w:before="60" w:line="240" w:lineRule="auto"/>
               <w:jc w:val="left"/>
             </w:pPr>
             <w:r>
               <w:rPr>
-                <w:rFonts w:ascii="Times New Roman" w:hAnsi="Times New Roman"/>
                 <w:b/>
                 <w:color w:val="000000"/>
                 <w:sz w:val="21"/>
@@ -12623,554 +13309,689 @@
         </w:tc>
       </w:tr>
       <w:tr>
-        <w:tblPrEx>
-          <w:tblCellMar>
-            <w:top w:w="0" w:type="dxa"/>
-            <w:left w:w="108" w:type="dxa"/>
-            <w:bottom w:w="0" w:type="dxa"/>
-            <w:right w:w="108" w:type="dxa"/>
-          </w:tblCellMar>
-        </w:tblPrEx>
         <w:trPr>
           <w:cantSplit/>
         </w:trPr>
         <w:tc>
           <w:tcPr>
-            <w:tcW w:w="2375" w:type="dxa"/>
-            <w:tcBorders>
-              <w:top w:val="single" w:color="D9D9D9" w:sz="4" w:space="0"/>
-              <w:left w:val="single" w:color="D9D9D9" w:sz="4" w:space="0"/>
-              <w:bottom w:val="single" w:color="D9D9D9" w:sz="4" w:space="0"/>
-              <w:right w:val="single" w:color="D9D9D9" w:sz="4" w:space="0"/>
-            </w:tcBorders>
-            <w:tcMar>
-              <w:top w:w="75" w:type="dxa"/>
-              <w:left w:w="90" w:type="dxa"/>
-              <w:bottom w:w="75" w:type="dxa"/>
-              <w:right w:w="90" w:type="dxa"/>
-            </w:tcMar>
-            <w:vAlign w:val="center"/>
-          </w:tcPr>
-          <w:p>
-            <w:pPr>
-              <w:spacing w:after="40" w:line="264" w:lineRule="auto"/>
+            <w:tcW w:type="dxa" w:w="2375"/>
+          </w:tcPr>
+          <w:p>
+            <w:pPr>
+              <w:spacing w:after="60" w:before="60" w:line="240" w:lineRule="auto"/>
               <w:jc w:val="left"/>
             </w:pPr>
             <w:r>
               <w:rPr>
-                <w:rFonts w:ascii="Times New Roman" w:hAnsi="Times New Roman"/>
-                <w:b w:val="0"/>
-                <w:color w:val="000000"/>
-                <w:sz w:val="21"/>
-              </w:rPr>
-              <w:t>Connection refused</w:t>
-            </w:r>
-          </w:p>
-        </w:tc>
-        <w:tc>
-          <w:tcPr>
-            <w:tcW w:w="6985" w:type="dxa"/>
-            <w:tcBorders>
-              <w:top w:val="single" w:color="D9D9D9" w:sz="4" w:space="0"/>
-              <w:left w:val="single" w:color="D9D9D9" w:sz="4" w:space="0"/>
-              <w:bottom w:val="single" w:color="D9D9D9" w:sz="4" w:space="0"/>
-              <w:right w:val="single" w:color="D9D9D9" w:sz="4" w:space="0"/>
-            </w:tcBorders>
-            <w:tcMar>
-              <w:top w:w="75" w:type="dxa"/>
-              <w:left w:w="90" w:type="dxa"/>
-              <w:bottom w:w="75" w:type="dxa"/>
-              <w:right w:w="90" w:type="dxa"/>
-            </w:tcMar>
-            <w:vAlign w:val="center"/>
-          </w:tcPr>
-          <w:p>
-            <w:pPr>
-              <w:spacing w:after="40" w:line="264" w:lineRule="auto"/>
+                <w:b w:val="0"/>
+                <w:color w:val="000000"/>
+                <w:sz w:val="21"/>
+              </w:rPr>
+              <w:t>Dependency installation rejects NumPy</w:t>
+            </w:r>
+          </w:p>
+        </w:tc>
+        <w:tc>
+          <w:tcPr>
+            <w:tcW w:type="dxa" w:w="6985"/>
+          </w:tcPr>
+          <w:p>
+            <w:pPr>
+              <w:spacing w:after="60" w:before="60" w:line="240" w:lineRule="auto"/>
               <w:jc w:val="left"/>
             </w:pPr>
             <w:r>
               <w:rPr>
-                <w:rFonts w:ascii="Times New Roman" w:hAnsi="Times New Roman"/>
-                <w:b w:val="0"/>
-                <w:color w:val="000000"/>
-                <w:sz w:val="21"/>
-              </w:rPr>
-              <w:t>Start the backend; match its port to the frontend proxy target.</w:t>
+                <w:b w:val="0"/>
+                <w:color w:val="000000"/>
+                <w:sz w:val="21"/>
+              </w:rPr>
+              <w:t>Check the environment interpreter is Python 3.12; base CI's 3.11 does not include vision</w:t>
             </w:r>
           </w:p>
         </w:tc>
       </w:tr>
       <w:tr>
-        <w:tblPrEx>
-          <w:tblCellMar>
-            <w:top w:w="0" w:type="dxa"/>
-            <w:left w:w="108" w:type="dxa"/>
-            <w:bottom w:w="0" w:type="dxa"/>
-            <w:right w:w="108" w:type="dxa"/>
-          </w:tblCellMar>
-        </w:tblPrEx>
         <w:trPr>
           <w:cantSplit/>
         </w:trPr>
         <w:tc>
           <w:tcPr>
-            <w:tcW w:w="2375" w:type="dxa"/>
-            <w:tcBorders>
-              <w:top w:val="single" w:color="D9D9D9" w:sz="4" w:space="0"/>
-              <w:left w:val="single" w:color="D9D9D9" w:sz="4" w:space="0"/>
-              <w:bottom w:val="single" w:color="D9D9D9" w:sz="4" w:space="0"/>
-              <w:right w:val="single" w:color="D9D9D9" w:sz="4" w:space="0"/>
-            </w:tcBorders>
-            <w:tcMar>
-              <w:top w:w="75" w:type="dxa"/>
-              <w:left w:w="90" w:type="dxa"/>
-              <w:bottom w:w="75" w:type="dxa"/>
-              <w:right w:w="90" w:type="dxa"/>
-            </w:tcMar>
-            <w:vAlign w:val="center"/>
-          </w:tcPr>
-          <w:p>
-            <w:pPr>
-              <w:spacing w:after="40" w:line="264" w:lineRule="auto"/>
+            <w:tcW w:type="dxa" w:w="2375"/>
+          </w:tcPr>
+          <w:p>
+            <w:pPr>
+              <w:spacing w:after="60" w:before="60" w:line="240" w:lineRule="auto"/>
               <w:jc w:val="left"/>
             </w:pPr>
             <w:r>
               <w:rPr>
-                <w:rFonts w:ascii="Times New Roman" w:hAnsi="Times New Roman"/>
-                <w:b w:val="0"/>
-                <w:color w:val="000000"/>
-                <w:sz w:val="21"/>
-              </w:rPr>
-              <w:t>401 or 403</w:t>
-            </w:r>
-          </w:p>
-        </w:tc>
-        <w:tc>
-          <w:tcPr>
-            <w:tcW w:w="6985" w:type="dxa"/>
-            <w:tcBorders>
-              <w:top w:val="single" w:color="D9D9D9" w:sz="4" w:space="0"/>
-              <w:left w:val="single" w:color="D9D9D9" w:sz="4" w:space="0"/>
-              <w:bottom w:val="single" w:color="D9D9D9" w:sz="4" w:space="0"/>
-              <w:right w:val="single" w:color="D9D9D9" w:sz="4" w:space="0"/>
-            </w:tcBorders>
-            <w:tcMar>
-              <w:top w:w="75" w:type="dxa"/>
-              <w:left w:w="90" w:type="dxa"/>
-              <w:bottom w:w="75" w:type="dxa"/>
-              <w:right w:w="90" w:type="dxa"/>
-            </w:tcMar>
-            <w:vAlign w:val="center"/>
-          </w:tcPr>
-          <w:p>
-            <w:pPr>
-              <w:spacing w:after="40" w:line="264" w:lineRule="auto"/>
+                <w:b w:val="0"/>
+                <w:color w:val="000000"/>
+                <w:sz w:val="21"/>
+              </w:rPr>
+              <w:t>Connection refused</w:t>
+            </w:r>
+          </w:p>
+        </w:tc>
+        <w:tc>
+          <w:tcPr>
+            <w:tcW w:type="dxa" w:w="6985"/>
+          </w:tcPr>
+          <w:p>
+            <w:pPr>
+              <w:spacing w:after="60" w:before="60" w:line="240" w:lineRule="auto"/>
               <w:jc w:val="left"/>
             </w:pPr>
             <w:r>
               <w:rPr>
-                <w:rFonts w:ascii="Times New Roman" w:hAnsi="Times New Roman"/>
-                <w:b w:val="0"/>
-                <w:color w:val="000000"/>
-                <w:sz w:val="21"/>
-              </w:rPr>
-              <w:t>Sign in with the correct role; check session, CSRF and same-host usage.</w:t>
+                <w:b w:val="0"/>
+                <w:color w:val="000000"/>
+                <w:sz w:val="21"/>
+              </w:rPr>
+              <w:t>Start the backend and match the frontend proxy target</w:t>
             </w:r>
           </w:p>
         </w:tc>
       </w:tr>
       <w:tr>
-        <w:tblPrEx>
-          <w:tblCellMar>
-            <w:top w:w="0" w:type="dxa"/>
-            <w:left w:w="108" w:type="dxa"/>
-            <w:bottom w:w="0" w:type="dxa"/>
-            <w:right w:w="108" w:type="dxa"/>
-          </w:tblCellMar>
-        </w:tblPrEx>
         <w:trPr>
           <w:cantSplit/>
         </w:trPr>
         <w:tc>
           <w:tcPr>
-            <w:tcW w:w="2375" w:type="dxa"/>
-            <w:tcBorders>
-              <w:top w:val="single" w:color="D9D9D9" w:sz="4" w:space="0"/>
-              <w:left w:val="single" w:color="D9D9D9" w:sz="4" w:space="0"/>
-              <w:bottom w:val="single" w:color="D9D9D9" w:sz="4" w:space="0"/>
-              <w:right w:val="single" w:color="D9D9D9" w:sz="4" w:space="0"/>
-            </w:tcBorders>
-            <w:tcMar>
-              <w:top w:w="75" w:type="dxa"/>
-              <w:left w:w="90" w:type="dxa"/>
-              <w:bottom w:w="75" w:type="dxa"/>
-              <w:right w:w="90" w:type="dxa"/>
-            </w:tcMar>
-            <w:vAlign w:val="center"/>
-          </w:tcPr>
-          <w:p>
-            <w:pPr>
-              <w:spacing w:after="40" w:line="264" w:lineRule="auto"/>
+            <w:tcW w:type="dxa" w:w="2375"/>
+          </w:tcPr>
+          <w:p>
+            <w:pPr>
+              <w:spacing w:after="60" w:before="60" w:line="240" w:lineRule="auto"/>
               <w:jc w:val="left"/>
             </w:pPr>
             <w:r>
               <w:rPr>
-                <w:rFonts w:ascii="Times New Roman" w:hAnsi="Times New Roman"/>
-                <w:b w:val="0"/>
-                <w:color w:val="000000"/>
-                <w:sz w:val="21"/>
-              </w:rPr>
-              <w:t>Database is locked</w:t>
-            </w:r>
-          </w:p>
-        </w:tc>
-        <w:tc>
-          <w:tcPr>
-            <w:tcW w:w="6985" w:type="dxa"/>
-            <w:tcBorders>
-              <w:top w:val="single" w:color="D9D9D9" w:sz="4" w:space="0"/>
-              <w:left w:val="single" w:color="D9D9D9" w:sz="4" w:space="0"/>
-              <w:bottom w:val="single" w:color="D9D9D9" w:sz="4" w:space="0"/>
-              <w:right w:val="single" w:color="D9D9D9" w:sz="4" w:space="0"/>
-            </w:tcBorders>
-            <w:tcMar>
-              <w:top w:w="75" w:type="dxa"/>
-              <w:left w:w="90" w:type="dxa"/>
-              <w:bottom w:w="75" w:type="dxa"/>
-              <w:right w:w="90" w:type="dxa"/>
-            </w:tcMar>
-            <w:vAlign w:val="center"/>
-          </w:tcPr>
-          <w:p>
-            <w:pPr>
-              <w:spacing w:after="40" w:line="264" w:lineRule="auto"/>
+                <w:b w:val="0"/>
+                <w:color w:val="000000"/>
+                <w:sz w:val="21"/>
+              </w:rPr>
+              <w:t>401/403</w:t>
+            </w:r>
+          </w:p>
+        </w:tc>
+        <w:tc>
+          <w:tcPr>
+            <w:tcW w:type="dxa" w:w="6985"/>
+          </w:tcPr>
+          <w:p>
+            <w:pPr>
+              <w:spacing w:after="60" w:before="60" w:line="240" w:lineRule="auto"/>
               <w:jc w:val="left"/>
             </w:pPr>
             <w:r>
               <w:rPr>
-                <w:rFonts w:ascii="Times New Roman" w:hAnsi="Times New Roman"/>
-                <w:b w:val="0"/>
-                <w:color w:val="000000"/>
-                <w:sz w:val="21"/>
-              </w:rPr>
-              <w:t>End outstanding database-viewer transactions and disconnect; do not delete the database.</w:t>
+                <w:b w:val="0"/>
+                <w:color w:val="000000"/>
+                <w:sz w:val="21"/>
+              </w:rPr>
+              <w:t>Check sign-in, account role, session host and CSRF token</w:t>
             </w:r>
           </w:p>
         </w:tc>
       </w:tr>
       <w:tr>
-        <w:tblPrEx>
-          <w:tblCellMar>
-            <w:top w:w="0" w:type="dxa"/>
-            <w:left w:w="108" w:type="dxa"/>
-            <w:bottom w:w="0" w:type="dxa"/>
-            <w:right w:w="108" w:type="dxa"/>
-          </w:tblCellMar>
-        </w:tblPrEx>
         <w:trPr>
           <w:cantSplit/>
         </w:trPr>
         <w:tc>
           <w:tcPr>
-            <w:tcW w:w="2375" w:type="dxa"/>
-            <w:tcBorders>
-              <w:top w:val="single" w:color="D9D9D9" w:sz="4" w:space="0"/>
-              <w:left w:val="single" w:color="D9D9D9" w:sz="4" w:space="0"/>
-              <w:bottom w:val="single" w:color="D9D9D9" w:sz="4" w:space="0"/>
-              <w:right w:val="single" w:color="D9D9D9" w:sz="4" w:space="0"/>
-            </w:tcBorders>
-            <w:tcMar>
-              <w:top w:w="75" w:type="dxa"/>
-              <w:left w:w="90" w:type="dxa"/>
-              <w:bottom w:w="75" w:type="dxa"/>
-              <w:right w:w="90" w:type="dxa"/>
-            </w:tcMar>
-            <w:vAlign w:val="center"/>
-          </w:tcPr>
-          <w:p>
-            <w:pPr>
-              <w:spacing w:after="40" w:line="264" w:lineRule="auto"/>
+            <w:tcW w:type="dxa" w:w="2375"/>
+          </w:tcPr>
+          <w:p>
+            <w:pPr>
+              <w:spacing w:after="60" w:before="60" w:line="240" w:lineRule="auto"/>
               <w:jc w:val="left"/>
             </w:pPr>
             <w:r>
               <w:rPr>
-                <w:rFonts w:ascii="Times New Roman" w:hAnsi="Times New Roman"/>
-                <w:b w:val="0"/>
-                <w:color w:val="000000"/>
-                <w:sz w:val="21"/>
-              </w:rPr>
-              <w:t>Real inference unavailable</w:t>
-            </w:r>
-          </w:p>
-        </w:tc>
-        <w:tc>
-          <w:tcPr>
-            <w:tcW w:w="6985" w:type="dxa"/>
-            <w:tcBorders>
-              <w:top w:val="single" w:color="D9D9D9" w:sz="4" w:space="0"/>
-              <w:left w:val="single" w:color="D9D9D9" w:sz="4" w:space="0"/>
-              <w:bottom w:val="single" w:color="D9D9D9" w:sz="4" w:space="0"/>
-              <w:right w:val="single" w:color="D9D9D9" w:sz="4" w:space="0"/>
-            </w:tcBorders>
-            <w:tcMar>
-              <w:top w:w="75" w:type="dxa"/>
-              <w:left w:w="90" w:type="dxa"/>
-              <w:bottom w:w="75" w:type="dxa"/>
-              <w:right w:w="90" w:type="dxa"/>
-            </w:tcMar>
-            <w:vAlign w:val="center"/>
-          </w:tcPr>
-          <w:p>
-            <w:pPr>
-              <w:spacing w:after="40" w:line="264" w:lineRule="auto"/>
+                <w:b w:val="0"/>
+                <w:color w:val="000000"/>
+                <w:sz w:val="21"/>
+              </w:rPr>
+              <w:t>Database locked</w:t>
+            </w:r>
+          </w:p>
+        </w:tc>
+        <w:tc>
+          <w:tcPr>
+            <w:tcW w:type="dxa" w:w="6985"/>
+          </w:tcPr>
+          <w:p>
+            <w:pPr>
+              <w:spacing w:after="60" w:before="60" w:line="240" w:lineRule="auto"/>
               <w:jc w:val="left"/>
             </w:pPr>
             <w:r>
               <w:rPr>
-                <w:rFonts w:ascii="Times New Roman" w:hAnsi="Times New Roman"/>
-                <w:b w:val="0"/>
-                <w:color w:val="000000"/>
-                <w:sz w:val="21"/>
-              </w:rPr>
-              <w:t>Install pinned vision dependencies and check the approved weight/manifest; restart after a failed load.</w:t>
+                <w:b w:val="0"/>
+                <w:color w:val="000000"/>
+                <w:sz w:val="21"/>
+              </w:rPr>
+              <w:t>End outstanding viewer transactions; do not delete the database</w:t>
             </w:r>
           </w:p>
         </w:tc>
       </w:tr>
       <w:tr>
-        <w:tblPrEx>
-          <w:tblCellMar>
-            <w:top w:w="0" w:type="dxa"/>
-            <w:left w:w="108" w:type="dxa"/>
-            <w:bottom w:w="0" w:type="dxa"/>
-            <w:right w:w="108" w:type="dxa"/>
-          </w:tblCellMar>
-        </w:tblPrEx>
         <w:trPr>
           <w:cantSplit/>
         </w:trPr>
         <w:tc>
           <w:tcPr>
-            <w:tcW w:w="2375" w:type="dxa"/>
-            <w:tcBorders>
-              <w:top w:val="single" w:color="D9D9D9" w:sz="4" w:space="0"/>
-              <w:left w:val="single" w:color="D9D9D9" w:sz="4" w:space="0"/>
-              <w:bottom w:val="single" w:color="D9D9D9" w:sz="4" w:space="0"/>
-              <w:right w:val="single" w:color="D9D9D9" w:sz="4" w:space="0"/>
-            </w:tcBorders>
-            <w:tcMar>
-              <w:top w:w="75" w:type="dxa"/>
-              <w:left w:w="90" w:type="dxa"/>
-              <w:bottom w:w="75" w:type="dxa"/>
-              <w:right w:w="90" w:type="dxa"/>
-            </w:tcMar>
-            <w:vAlign w:val="center"/>
-          </w:tcPr>
-          <w:p>
-            <w:pPr>
-              <w:spacing w:after="40" w:line="264" w:lineRule="auto"/>
+            <w:tcW w:type="dxa" w:w="2375"/>
+          </w:tcPr>
+          <w:p>
+            <w:pPr>
+              <w:spacing w:after="60" w:before="60" w:line="240" w:lineRule="auto"/>
               <w:jc w:val="left"/>
             </w:pPr>
             <w:r>
               <w:rPr>
-                <w:rFonts w:ascii="Times New Roman" w:hAnsi="Times New Roman"/>
-                <w:b w:val="0"/>
-                <w:color w:val="000000"/>
-                <w:sz w:val="21"/>
-              </w:rPr>
-              <w:t>Stale plan or 409</w:t>
-            </w:r>
-          </w:p>
-        </w:tc>
-        <w:tc>
-          <w:tcPr>
-            <w:tcW w:w="6985" w:type="dxa"/>
-            <w:tcBorders>
-              <w:top w:val="single" w:color="D9D9D9" w:sz="4" w:space="0"/>
-              <w:left w:val="single" w:color="D9D9D9" w:sz="4" w:space="0"/>
-              <w:bottom w:val="single" w:color="D9D9D9" w:sz="4" w:space="0"/>
-              <w:right w:val="single" w:color="D9D9D9" w:sz="4" w:space="0"/>
-            </w:tcBorders>
-            <w:tcMar>
-              <w:top w:w="75" w:type="dxa"/>
-              <w:left w:w="90" w:type="dxa"/>
-              <w:bottom w:w="75" w:type="dxa"/>
-              <w:right w:w="90" w:type="dxa"/>
-            </w:tcMar>
-            <w:vAlign w:val="center"/>
-          </w:tcPr>
-          <w:p>
-            <w:pPr>
-              <w:spacing w:after="40" w:line="264" w:lineRule="auto"/>
+                <w:b w:val="0"/>
+                <w:color w:val="000000"/>
+                <w:sz w:val="21"/>
+              </w:rPr>
+              <w:t>Real inference unavailable</w:t>
+            </w:r>
+          </w:p>
+        </w:tc>
+        <w:tc>
+          <w:tcPr>
+            <w:tcW w:type="dxa" w:w="6985"/>
+          </w:tcPr>
+          <w:p>
+            <w:pPr>
+              <w:spacing w:after="60" w:before="60" w:line="240" w:lineRule="auto"/>
               <w:jc w:val="left"/>
             </w:pPr>
             <w:r>
               <w:rPr>
-                <w:rFonts w:ascii="Times New Roman" w:hAnsi="Times New Roman"/>
-                <w:b w:val="0"/>
-                <w:color w:val="000000"/>
-                <w:sz w:val="21"/>
-              </w:rPr>
-              <w:t>Refresh the current state and explicitly replan or retry with a current version.</w:t>
+                <w:b w:val="0"/>
+                <w:color w:val="000000"/>
+                <w:sz w:val="21"/>
+              </w:rPr>
+              <w:t>Install vision requirements, verify the bundled weight/manifest and restart after a failed load</w:t>
             </w:r>
           </w:p>
         </w:tc>
       </w:tr>
       <w:tr>
-        <w:tblPrEx>
-          <w:tblCellMar>
-            <w:top w:w="0" w:type="dxa"/>
-            <w:left w:w="108" w:type="dxa"/>
-            <w:bottom w:w="0" w:type="dxa"/>
-            <w:right w:w="108" w:type="dxa"/>
-          </w:tblCellMar>
-        </w:tblPrEx>
         <w:trPr>
           <w:cantSplit/>
         </w:trPr>
         <w:tc>
           <w:tcPr>
-            <w:tcW w:w="2375" w:type="dxa"/>
-            <w:tcBorders>
-              <w:top w:val="single" w:color="D9D9D9" w:sz="4" w:space="0"/>
-              <w:left w:val="single" w:color="D9D9D9" w:sz="4" w:space="0"/>
-              <w:bottom w:val="single" w:color="D9D9D9" w:sz="4" w:space="0"/>
-              <w:right w:val="single" w:color="D9D9D9" w:sz="4" w:space="0"/>
-            </w:tcBorders>
-            <w:tcMar>
-              <w:top w:w="75" w:type="dxa"/>
-              <w:left w:w="90" w:type="dxa"/>
-              <w:bottom w:w="75" w:type="dxa"/>
-              <w:right w:w="90" w:type="dxa"/>
-            </w:tcMar>
-            <w:vAlign w:val="center"/>
-          </w:tcPr>
-          <w:p>
-            <w:pPr>
-              <w:spacing w:after="40" w:line="264" w:lineRule="auto"/>
+            <w:tcW w:type="dxa" w:w="2375"/>
+          </w:tcPr>
+          <w:p>
+            <w:pPr>
+              <w:spacing w:after="60" w:before="60" w:line="240" w:lineRule="auto"/>
               <w:jc w:val="left"/>
             </w:pPr>
             <w:r>
               <w:rPr>
-                <w:rFonts w:ascii="Times New Roman" w:hAnsi="Times New Roman"/>
-                <w:b w:val="0"/>
-                <w:color w:val="000000"/>
-                <w:sz w:val="21"/>
-              </w:rPr>
-              <w:t>Unassigned task</w:t>
-            </w:r>
-          </w:p>
-        </w:tc>
-        <w:tc>
-          <w:tcPr>
-            <w:tcW w:w="6985" w:type="dxa"/>
-            <w:tcBorders>
-              <w:top w:val="single" w:color="D9D9D9" w:sz="4" w:space="0"/>
-              <w:left w:val="single" w:color="D9D9D9" w:sz="4" w:space="0"/>
-              <w:bottom w:val="single" w:color="D9D9D9" w:sz="4" w:space="0"/>
-              <w:right w:val="single" w:color="D9D9D9" w:sz="4" w:space="0"/>
-            </w:tcBorders>
-            <w:tcMar>
-              <w:top w:w="75" w:type="dxa"/>
-              <w:left w:w="90" w:type="dxa"/>
-              <w:bottom w:w="75" w:type="dxa"/>
-              <w:right w:w="90" w:type="dxa"/>
-            </w:tcMar>
-            <w:vAlign w:val="center"/>
-          </w:tcPr>
-          <w:p>
-            <w:pPr>
-              <w:spacing w:after="40" w:line="264" w:lineRule="auto"/>
+                <w:b w:val="0"/>
+                <w:color w:val="000000"/>
+                <w:sz w:val="21"/>
+              </w:rPr>
+              <w:t>Stale plan or 409</w:t>
+            </w:r>
+          </w:p>
+        </w:tc>
+        <w:tc>
+          <w:tcPr>
+            <w:tcW w:type="dxa" w:w="6985"/>
+          </w:tcPr>
+          <w:p>
+            <w:pPr>
+              <w:spacing w:after="60" w:before="60" w:line="240" w:lineRule="auto"/>
               <w:jc w:val="left"/>
             </w:pPr>
             <w:r>
               <w:rPr>
-                <w:rFonts w:ascii="Times New Roman" w:hAnsi="Times New Roman"/>
-                <w:b w:val="0"/>
-                <w:color w:val="000000"/>
-                <w:sz w:val="21"/>
-              </w:rPr>
-              <w:t>Read the recorded reason, including unavailable crews or the shift limit.</w:t>
+                <w:b w:val="0"/>
+                <w:color w:val="000000"/>
+                <w:sz w:val="21"/>
+              </w:rPr>
+              <w:t>Refresh current state and explicitly replan or retry with the current record version</w:t>
             </w:r>
           </w:p>
         </w:tc>
       </w:tr>
       <w:tr>
-        <w:tblPrEx>
-          <w:tblCellMar>
-            <w:top w:w="0" w:type="dxa"/>
-            <w:left w:w="108" w:type="dxa"/>
-            <w:bottom w:w="0" w:type="dxa"/>
-            <w:right w:w="108" w:type="dxa"/>
-          </w:tblCellMar>
-        </w:tblPrEx>
         <w:trPr>
           <w:cantSplit/>
         </w:trPr>
         <w:tc>
           <w:tcPr>
-            <w:tcW w:w="2375" w:type="dxa"/>
-            <w:tcBorders>
-              <w:top w:val="single" w:color="D9D9D9" w:sz="4" w:space="0"/>
-              <w:left w:val="single" w:color="D9D9D9" w:sz="4" w:space="0"/>
-              <w:bottom w:val="single" w:color="D9D9D9" w:sz="4" w:space="0"/>
-              <w:right w:val="single" w:color="D9D9D9" w:sz="4" w:space="0"/>
-            </w:tcBorders>
-            <w:tcMar>
-              <w:top w:w="75" w:type="dxa"/>
-              <w:left w:w="90" w:type="dxa"/>
-              <w:bottom w:w="75" w:type="dxa"/>
-              <w:right w:w="90" w:type="dxa"/>
-            </w:tcMar>
-            <w:vAlign w:val="center"/>
-          </w:tcPr>
-          <w:p>
-            <w:pPr>
-              <w:spacing w:after="40" w:line="264" w:lineRule="auto"/>
+            <w:tcW w:type="dxa" w:w="2375"/>
+          </w:tcPr>
+          <w:p>
+            <w:pPr>
+              <w:spacing w:after="60" w:before="60" w:line="240" w:lineRule="auto"/>
               <w:jc w:val="left"/>
             </w:pPr>
             <w:r>
               <w:rPr>
-                <w:rFonts w:ascii="Times New Roman" w:hAnsi="Times New Roman"/>
-                <w:b w:val="0"/>
-                <w:color w:val="000000"/>
-                <w:sz w:val="21"/>
-              </w:rPr>
-              <w:t>Google error</w:t>
-            </w:r>
-          </w:p>
-        </w:tc>
-        <w:tc>
-          <w:tcPr>
-            <w:tcW w:w="6985" w:type="dxa"/>
-            <w:tcBorders>
-              <w:top w:val="single" w:color="D9D9D9" w:sz="4" w:space="0"/>
-              <w:left w:val="single" w:color="D9D9D9" w:sz="4" w:space="0"/>
-              <w:bottom w:val="single" w:color="D9D9D9" w:sz="4" w:space="0"/>
-              <w:right w:val="single" w:color="D9D9D9" w:sz="4" w:space="0"/>
-            </w:tcBorders>
-            <w:tcMar>
-              <w:top w:w="75" w:type="dxa"/>
-              <w:left w:w="90" w:type="dxa"/>
-              <w:bottom w:w="75" w:type="dxa"/>
-              <w:right w:w="90" w:type="dxa"/>
-            </w:tcMar>
-            <w:vAlign w:val="center"/>
-          </w:tcPr>
-          <w:p>
-            <w:pPr>
-              <w:spacing w:after="40" w:line="264" w:lineRule="auto"/>
+                <w:b w:val="0"/>
+                <w:color w:val="000000"/>
+                <w:sz w:val="21"/>
+              </w:rPr>
+              <w:t>Unassigned tasks</w:t>
+            </w:r>
+          </w:p>
+        </w:tc>
+        <w:tc>
+          <w:tcPr>
+            <w:tcW w:type="dxa" w:w="6985"/>
+          </w:tcPr>
+          <w:p>
+            <w:pPr>
+              <w:spacing w:after="60" w:before="60" w:line="240" w:lineRule="auto"/>
               <w:jc w:val="left"/>
             </w:pPr>
             <w:r>
               <w:rPr>
-                <w:rFonts w:ascii="Times New Roman" w:hAnsi="Times New Roman"/>
-                <w:b w:val="0"/>
-                <w:color w:val="000000"/>
-                <w:sz w:val="21"/>
-              </w:rPr>
-              <w:t>Check server-side credentials/service access; errors do not silently become simulation.</w:t>
+                <w:b w:val="0"/>
+                <w:color w:val="000000"/>
+                <w:sz w:val="21"/>
+              </w:rPr>
+              <w:t>Read the reasons, including unavailable crews or shift limits</w:t>
+            </w:r>
+          </w:p>
+        </w:tc>
+      </w:tr>
+      <w:tr>
+        <w:trPr>
+          <w:cantSplit/>
+        </w:trPr>
+        <w:tc>
+          <w:tcPr>
+            <w:tcW w:type="dxa" w:w="2375"/>
+          </w:tcPr>
+          <w:p>
+            <w:pPr>
+              <w:spacing w:after="60" w:before="60" w:line="240" w:lineRule="auto"/>
+              <w:jc w:val="left"/>
+            </w:pPr>
+            <w:r>
+              <w:rPr>
+                <w:b w:val="0"/>
+                <w:color w:val="000000"/>
+                <w:sz w:val="21"/>
+              </w:rPr>
+              <w:t>Embedding model unavailable or index missing/stale</w:t>
+            </w:r>
+          </w:p>
+        </w:tc>
+        <w:tc>
+          <w:tcPr>
+            <w:tcW w:type="dxa" w:w="6985"/>
+          </w:tcPr>
+          <w:p>
+            <w:pPr>
+              <w:spacing w:after="60" w:before="60" w:line="240" w:lineRule="auto"/>
+              <w:jc w:val="left"/>
+            </w:pPr>
+            <w:r>
+              <w:rPr>
+                <w:b w:val="0"/>
+                <w:color w:val="000000"/>
+                <w:sz w:val="21"/>
+              </w:rPr>
+              <w:t>Install full backend requirements, verify configured paths, run the explicit index command and restart; HTTP requests do not repair indexes</w:t>
+            </w:r>
+          </w:p>
+        </w:tc>
+      </w:tr>
+      <w:tr>
+        <w:trPr>
+          <w:cantSplit/>
+        </w:trPr>
+        <w:tc>
+          <w:tcPr>
+            <w:tcW w:type="dxa" w:w="2375"/>
+          </w:tcPr>
+          <w:p>
+            <w:pPr>
+              <w:spacing w:after="60" w:before="60" w:line="240" w:lineRule="auto"/>
+              <w:jc w:val="left"/>
+            </w:pPr>
+            <w:r>
+              <w:rPr>
+                <w:b w:val="0"/>
+                <w:color w:val="000000"/>
+                <w:sz w:val="21"/>
+              </w:rPr>
+              <w:t>Invalid assistant configuration</w:t>
+            </w:r>
+          </w:p>
+        </w:tc>
+        <w:tc>
+          <w:tcPr>
+            <w:tcW w:type="dxa" w:w="6985"/>
+          </w:tcPr>
+          <w:p>
+            <w:pPr>
+              <w:spacing w:after="60" w:before="60" w:line="240" w:lineRule="auto"/>
+              <w:jc w:val="left"/>
+            </w:pPr>
+            <w:r>
+              <w:rPr>
+                <w:b w:val="0"/>
+                <w:color w:val="000000"/>
+                <w:sz w:val="21"/>
+              </w:rPr>
+              <w:t>Use lowercase true/false, a valid model name and documented limit ranges, then restart</w:t>
+            </w:r>
+          </w:p>
+        </w:tc>
+      </w:tr>
+      <w:tr>
+        <w:trPr>
+          <w:cantSplit/>
+        </w:trPr>
+        <w:tc>
+          <w:tcPr>
+            <w:tcW w:type="dxa" w:w="2375"/>
+          </w:tcPr>
+          <w:p>
+            <w:pPr>
+              <w:spacing w:after="60" w:before="60" w:line="240" w:lineRule="auto"/>
+              <w:jc w:val="left"/>
+            </w:pPr>
+            <w:r>
+              <w:rPr>
+                <w:b w:val="0"/>
+                <w:color w:val="000000"/>
+                <w:sz w:val="21"/>
+              </w:rPr>
+              <w:t>GPT unavailable, quota or provider error</w:t>
+            </w:r>
+          </w:p>
+        </w:tc>
+        <w:tc>
+          <w:tcPr>
+            <w:tcW w:type="dxa" w:w="6985"/>
+          </w:tcPr>
+          <w:p>
+            <w:pPr>
+              <w:spacing w:after="60" w:before="60" w:line="240" w:lineRule="auto"/>
+              <w:jc w:val="left"/>
+            </w:pPr>
+            <w:r>
+              <w:rPr>
+                <w:b w:val="0"/>
+                <w:color w:val="000000"/>
+                <w:sz w:val="21"/>
+              </w:rPr>
+              <w:t>Check private server configuration, account access and local attempted-call budget; model identity remains available; do not repeatedly retry unknown outcomes</w:t>
+            </w:r>
+          </w:p>
+        </w:tc>
+      </w:tr>
+      <w:tr>
+        <w:trPr>
+          <w:cantSplit/>
+        </w:trPr>
+        <w:tc>
+          <w:tcPr>
+            <w:tcW w:type="dxa" w:w="2375"/>
+          </w:tcPr>
+          <w:p>
+            <w:pPr>
+              <w:spacing w:after="60" w:before="60" w:line="240" w:lineRule="auto"/>
+              <w:jc w:val="left"/>
+            </w:pPr>
+            <w:r>
+              <w:rPr>
+                <w:b w:val="0"/>
+                <w:color w:val="000000"/>
+                <w:sz w:val="21"/>
+              </w:rPr>
+              <w:t>Insufficient evidence or rejected answer</w:t>
+            </w:r>
+          </w:p>
+        </w:tc>
+        <w:tc>
+          <w:tcPr>
+            <w:tcW w:type="dxa" w:w="6985"/>
+          </w:tcPr>
+          <w:p>
+            <w:pPr>
+              <w:spacing w:after="60" w:before="60" w:line="240" w:lineRule="auto"/>
+              <w:jc w:val="left"/>
+            </w:pPr>
+            <w:r>
+              <w:rPr>
+                <w:b w:val="0"/>
+                <w:color w:val="000000"/>
+                <w:sz w:val="21"/>
+              </w:rPr>
+              <w:t>Narrow the question or select a current saved plan; inspect the explicit error, without bypassing citation validation</w:t>
+            </w:r>
+          </w:p>
+        </w:tc>
+      </w:tr>
+      <w:tr>
+        <w:trPr>
+          <w:cantSplit/>
+        </w:trPr>
+        <w:tc>
+          <w:tcPr>
+            <w:tcW w:type="dxa" w:w="2375"/>
+          </w:tcPr>
+          <w:p>
+            <w:pPr>
+              <w:spacing w:after="60" w:before="60" w:line="240" w:lineRule="auto"/>
+              <w:jc w:val="left"/>
+            </w:pPr>
+            <w:r>
+              <w:rPr>
+                <w:b w:val="0"/>
+                <w:color w:val="000000"/>
+                <w:sz w:val="21"/>
+              </w:rPr>
+              <w:t>Task preview expired or 409</w:t>
+            </w:r>
+          </w:p>
+        </w:tc>
+        <w:tc>
+          <w:tcPr>
+            <w:tcW w:type="dxa" w:w="6985"/>
+          </w:tcPr>
+          <w:p>
+            <w:pPr>
+              <w:spacing w:after="60" w:before="60" w:line="240" w:lineRule="auto"/>
+              <w:jc w:val="left"/>
+            </w:pPr>
+            <w:r>
+              <w:rPr>
+                <w:b w:val="0"/>
+                <w:color w:val="000000"/>
+                <w:sz w:val="21"/>
+              </w:rPr>
+              <w:t>Refresh task/plan/configuration and create a new preview before confirmation</w:t>
+            </w:r>
+          </w:p>
+        </w:tc>
+      </w:tr>
+      <w:tr>
+        <w:trPr>
+          <w:cantSplit/>
+        </w:trPr>
+        <w:tc>
+          <w:tcPr>
+            <w:tcW w:type="dxa" w:w="2375"/>
+          </w:tcPr>
+          <w:p>
+            <w:pPr>
+              <w:spacing w:after="60" w:before="60" w:line="240" w:lineRule="auto"/>
+              <w:jc w:val="left"/>
+            </w:pPr>
+            <w:r>
+              <w:rPr>
+                <w:b w:val="0"/>
+                <w:color w:val="000000"/>
+                <w:sz w:val="21"/>
+              </w:rPr>
+              <w:t>Move exceeds shift or travel is unknown</w:t>
+            </w:r>
+          </w:p>
+        </w:tc>
+        <w:tc>
+          <w:tcPr>
+            <w:tcW w:type="dxa" w:w="6985"/>
+          </w:tcPr>
+          <w:p>
+            <w:pPr>
+              <w:spacing w:after="60" w:before="60" w:line="240" w:lineRule="auto"/>
+              <w:jc w:val="left"/>
+            </w:pPr>
+            <w:r>
+              <w:rPr>
+                <w:b w:val="0"/>
+                <w:color w:val="000000"/>
+                <w:sz w:val="21"/>
+              </w:rPr>
+              <w:t>Inspect travel/service/return totals and availability; choose a feasible crew; other tasks are retained</w:t>
+            </w:r>
+          </w:p>
+        </w:tc>
+      </w:tr>
+      <w:tr>
+        <w:trPr>
+          <w:cantSplit/>
+        </w:trPr>
+        <w:tc>
+          <w:tcPr>
+            <w:tcW w:type="dxa" w:w="2375"/>
+          </w:tcPr>
+          <w:p>
+            <w:pPr>
+              <w:spacing w:after="60" w:before="60" w:line="240" w:lineRule="auto"/>
+              <w:jc w:val="left"/>
+            </w:pPr>
+            <w:r>
+              <w:rPr>
+                <w:b w:val="0"/>
+                <w:color w:val="000000"/>
+                <w:sz w:val="21"/>
+              </w:rPr>
+              <w:t>Constrained task unassigned</w:t>
+            </w:r>
+          </w:p>
+        </w:tc>
+        <w:tc>
+          <w:tcPr>
+            <w:tcW w:type="dxa" w:w="6985"/>
+          </w:tcPr>
+          <w:p>
+            <w:pPr>
+              <w:spacing w:after="60" w:before="60" w:line="240" w:lineRule="auto"/>
+              <w:jc w:val="left"/>
+            </w:pPr>
+            <w:r>
+              <w:rPr>
+                <w:b w:val="0"/>
+                <w:color w:val="000000"/>
+                <w:sz w:val="21"/>
+              </w:rPr>
+              <w:t>Inspect the locked crew and reason; later recalculation preserves the constraint rather than silently transferring work</w:t>
+            </w:r>
+          </w:p>
+        </w:tc>
+      </w:tr>
+      <w:tr>
+        <w:trPr>
+          <w:cantSplit/>
+        </w:trPr>
+        <w:tc>
+          <w:tcPr>
+            <w:tcW w:type="dxa" w:w="2375"/>
+          </w:tcPr>
+          <w:p>
+            <w:pPr>
+              <w:spacing w:after="60" w:before="60" w:line="240" w:lineRule="auto"/>
+              <w:jc w:val="left"/>
+            </w:pPr>
+            <w:r>
+              <w:rPr>
+                <w:b w:val="0"/>
+                <w:color w:val="000000"/>
+                <w:sz w:val="21"/>
+              </w:rPr>
+              <w:t>Crew access lost after reassignment</w:t>
+            </w:r>
+          </w:p>
+        </w:tc>
+        <w:tc>
+          <w:tcPr>
+            <w:tcW w:type="dxa" w:w="6985"/>
+          </w:tcPr>
+          <w:p>
+            <w:pPr>
+              <w:spacing w:after="60" w:before="60" w:line="240" w:lineRule="auto"/>
+              <w:jc w:val="left"/>
+            </w:pPr>
+            <w:r>
+              <w:rPr>
+                <w:b w:val="0"/>
+                <w:color w:val="000000"/>
+                <w:sz w:val="21"/>
+              </w:rPr>
+              <w:t>Dispatcher explicitly recalculates; the target crew then refreshes its latest saved GA route</w:t>
+            </w:r>
+          </w:p>
+        </w:tc>
+      </w:tr>
+      <w:tr>
+        <w:trPr>
+          <w:cantSplit/>
+        </w:trPr>
+        <w:tc>
+          <w:tcPr>
+            <w:tcW w:type="dxa" w:w="2375"/>
+          </w:tcPr>
+          <w:p>
+            <w:pPr>
+              <w:spacing w:after="60" w:before="60" w:line="240" w:lineRule="auto"/>
+              <w:jc w:val="left"/>
+            </w:pPr>
+            <w:r>
+              <w:rPr>
+                <w:b w:val="0"/>
+                <w:color w:val="000000"/>
+                <w:sz w:val="21"/>
+              </w:rPr>
+              <w:t>Google provider error</w:t>
+            </w:r>
+          </w:p>
+        </w:tc>
+        <w:tc>
+          <w:tcPr>
+            <w:tcW w:type="dxa" w:w="6985"/>
+          </w:tcPr>
+          <w:p>
+            <w:pPr>
+              <w:spacing w:after="60" w:before="60" w:line="240" w:lineRule="auto"/>
+              <w:jc w:val="left"/>
+            </w:pPr>
+            <w:r>
+              <w:rPr>
+                <w:b w:val="0"/>
+                <w:color w:val="000000"/>
+                <w:sz w:val="21"/>
+              </w:rPr>
+              <w:t>Check server credentials/service access; errors do not silently become simulation</w:t>
             </w:r>
           </w:p>
         </w:tc>
@@ -13178,19 +13999,31 @@
     </w:tbl>
     <w:p>
       <w:pPr>
-        <w:pStyle w:val="4"/>
-        <w:pageBreakBefore w:val="0"/>
         <w:jc w:val="left"/>
       </w:pPr>
-      <w:bookmarkStart w:id="26" w:name="_RGI_20"/>
-      <w:r>
-        <w:t>A.6 Optional Travel Time Provider</w:t>
-      </w:r>
-      <w:bookmarkEnd w:id="26"/>
     </w:p>
     <w:p>
-      <w:r>
-        <w:t>To use Google travel estimates, configure the following backend environment variables privately:</w:t>
+      <w:pPr>
+        <w:pStyle w:val="4"/>
+      </w:pPr>
+      <w:bookmarkStart w:id="1029" w:name="RGCurrentHeading29"/>
+      <w:r>
+        <w:rPr>
+          <w:color w:val="000000"/>
+        </w:rPr>
+        <w:t>A.9 Optional Google travel estimates</w:t>
+      </w:r>
+      <w:bookmarkEnd w:id="1029"/>
+    </w:p>
+    <w:p>
+      <w:pPr>
+        <w:jc w:val="left"/>
+      </w:pPr>
+      <w:r>
+        <w:rPr>
+          <w:color w:val="000000"/>
+        </w:rPr>
+        <w:t>Set these variables in the backend terminal, then restart and explicitly recalculate:</w:t>
       </w:r>
     </w:p>
     <w:p>
@@ -13199,18 +14032,59 @@
         <w:jc w:val="left"/>
       </w:pPr>
       <w:r>
-        <w:t>ROADGUARD_TRAVEL_MATRIX_PROVIDER=google_routes</w:t>
-      </w:r>
-      <w:r>
-        <w:br w:type="textWrapping"/>
-      </w:r>
-      <w:r>
-        <w:t>ROADGUARD_GOOGLE_MAPS_API_KEY=&lt;your private key&gt;</w:t>
+        <w:rPr>
+          <w:color w:val="000000"/>
+        </w:rPr>
+        <w:t>$env:ROADGUARD_TRAVEL_MATRIX_PROVIDER = 'google_routes'</w:t>
+        <w:br/>
+        <w:t>$env:ROADGUARD_GOOGLE_MAPS_API_KEY = '&lt;your private key&gt;'</w:t>
       </w:r>
     </w:p>
     <w:p>
-      <w:r>
-        <w:t>Restart the backend and explicitly recalculate. Provider usage may incur charges. The current implementation uses traffic-unaware driving estimates and schematic map segments; old plans retain their original source. Keep the key out of the report and frontend.</w:t>
+      <w:pPr>
+        <w:jc w:val="left"/>
+      </w:pPr>
+      <w:r>
+        <w:rPr>
+          <w:color w:val="000000"/>
+        </w:rPr>
+        <w:t>Usage may incur charges. Keep the key private and out of frontend source. The current provider uses traffic-unaware estimates; the map remains schematic. Old plans retain their original source. Recorded browser acceptance used simulation, not a new real-Google call. See the routing guide (../SystemCode/backend/roadguard/routing/README.md).</w:t>
+      </w:r>
+    </w:p>
+    <w:p>
+      <w:pPr>
+        <w:jc w:val="left"/>
+      </w:pPr>
+      <w:r>
+        <w:rPr>
+          <w:color w:val="000000"/>
+        </w:rPr>
+        <w:t>Retained operating details. The pinned vision requirements include PyTorch, torchvision and Ultralytics. In the crew workflow, the example crew02 account can act only for Crew 02 and may be idle; use the crew assigned in the latest saved GA plan. On an upload, inspect the detail page for provenance and stored rule information. A changed upload payload requires a new submission and Idempotency-Key; GET requests do not require CSRF.</w:t>
+      </w:r>
+    </w:p>
+    <w:p>
+      <w:pPr>
+        <w:jc w:val="left"/>
+      </w:pPr>
+      <w:r>
+        <w:rPr>
+          <w:color w:val="000000"/>
+        </w:rPr>
+        <w:t>Example real-upload metadata, supplied with the multipart image:</w:t>
+      </w:r>
+    </w:p>
+    <w:p>
+      <w:pPr>
+        <w:pStyle w:val="167"/>
+        <w:jc w:val="left"/>
+      </w:pPr>
+      <w:r>
+        <w:rPr>
+          <w:color w:val="000000"/>
+        </w:rPr>
+        <w:t>{"mode":"real","latitude":1.3405,"longitude":103.706,</w:t>
+        <w:br/>
+        <w:t xml:space="preserve"> "road_type":"public_motor_road"}</w:t>
       </w:r>
     </w:p>
     <w:p>
@@ -13218,11 +14092,13 @@
         <w:pStyle w:val="3"/>
         <w:pageBreakBefore/>
       </w:pPr>
+      <w:bookmarkStart w:id="1030" w:name="RGCurrentHeading30"/>
       <w:bookmarkStart w:id="27" w:name="appendix_b_proposal"/>
       <w:r>
         <w:t>Appendix B Submitted Project Proposal</w:t>
       </w:r>
       <w:bookmarkEnd w:id="27"/>
+      <w:bookmarkEnd w:id="1030"/>
     </w:p>
     <w:p>
       <w:r>
@@ -14014,11 +14890,13 @@
         <w:pStyle w:val="3"/>
         <w:pageBreakBefore/>
       </w:pPr>
+      <w:bookmarkStart w:id="1031" w:name="RGCurrentHeading31"/>
       <w:bookmarkStart w:id="28" w:name="appendix_c_mapping"/>
       <w:r>
         <w:t>Appendix C Course Functionality Mapping</w:t>
       </w:r>
       <w:bookmarkEnd w:id="28"/>
+      <w:bookmarkEnd w:id="1031"/>
     </w:p>
     <w:p>
       <w:r>
@@ -14249,7 +15127,7 @@
                 <w:color w:val="000000"/>
                 <w:sz w:val="21"/>
               </w:rPr>
-              <w:t>Confidence routing, label-to-priority and service rules, and review correction. Accepted evidence becomes one repair task.</w:t>
+              <w:t>Confidence routing, repair rules and human correction create tasks. Separately confirmed adjustments govern reassignment and cancellation.</w:t>
             </w:r>
           </w:p>
         </w:tc>
@@ -14270,7 +15148,7 @@
                 <w:color w:val="000000"/>
                 <w:sz w:val="21"/>
               </w:rPr>
-              <w:t>Versioned configuration, stored rule snapshots and decision traces; rules, inspections and tasks modules.</w:t>
+              <w:t>Versioned policies, stored rule snapshots and decision traces; preview validation, durable crew constraints and explicit replanning.</w:t>
             </w:r>
           </w:p>
         </w:tc>
@@ -14291,7 +15169,7 @@
                 <w:color w:val="000000"/>
                 <w:sz w:val="21"/>
               </w:rPr>
-              <w:t>Sections 2, 3.2 and 5.3: boundary, no-detection, correction and replay checks. Service durations remain project assumptions.</w:t>
+              <w:t>Sections 2, 3.2 and 5.3: boundary, correction, replay and controlled adjustment checks. Service durations remain assumptions.</w:t>
             </w:r>
           </w:p>
         </w:tc>
@@ -14459,24 +15337,24 @@
                 <w:sz w:val="21"/>
               </w:rPr>
               <w:t>CGS</w:t>
-            </w:r>
-            <w:r>
-              <w:rPr>
-                <w:rFonts w:ascii="Times New Roman" w:hAnsi="Times New Roman"/>
-                <w:b w:val="0"/>
-                <w:color w:val="000000"/>
-                <w:sz w:val="21"/>
-              </w:rPr>
-              <w:br w:type="textWrapping"/>
-            </w:r>
-            <w:r>
-              <w:rPr>
-                <w:rFonts w:ascii="Times New Roman" w:hAnsi="Times New Roman"/>
-                <w:b w:val="0"/>
-                <w:color w:val="000000"/>
-                <w:sz w:val="21"/>
-              </w:rPr>
-              <w:t>Learned visual perception</w:t>
+              <w:br/>
+              <w:t>Learned perception and grounded explanation</w:t>
+            </w:r>
+            <w:r>
+              <w:rPr>
+                <w:rFonts w:ascii="Times New Roman" w:hAnsi="Times New Roman"/>
+                <w:b w:val="0"/>
+                <w:color w:val="000000"/>
+                <w:sz w:val="21"/>
+              </w:rPr>
+            </w:r>
+            <w:r>
+              <w:rPr>
+                <w:rFonts w:ascii="Times New Roman" w:hAnsi="Times New Roman"/>
+                <w:b w:val="0"/>
+                <w:color w:val="000000"/>
+                <w:sz w:val="21"/>
+              </w:rPr>
             </w:r>
           </w:p>
         </w:tc>
@@ -14497,7 +15375,7 @@
                 <w:color w:val="000000"/>
                 <w:sz w:val="21"/>
               </w:rPr>
-              <w:t>YOLO11s predicts eight damage classes and boxes. Primary-candidate selection supplies a label and confidence to the business rules.</w:t>
+              <w:t>YOLO11s predicts eight classes and boxes; primary selection supplies evidence to rules. Retrieval and optional GPT explain reviewed knowledge and authorized saved plans.</w:t>
             </w:r>
           </w:p>
         </w:tc>
@@ -14518,7 +15396,7 @@
                 <w:color w:val="000000"/>
                 <w:sz w:val="21"/>
               </w:rPr>
-              <w:t>Grouped data preparation, supervised model training and local checkpoint inference; model and backend vision modules.</w:t>
+              <w:t>Grouped data, supervised training and local inference; static Chroma/E5 index, query-v3 exact citations and server-derived rule answers. Plan facts remain outside the index.</w:t>
             </w:r>
           </w:p>
         </w:tc>
@@ -14539,7 +15417,7 @@
                 <w:color w:val="000000"/>
                 <w:sz w:val="21"/>
               </w:rPr>
-              <w:t>Sections 2, 4 and 5.1: class-aware precision/recall, box metrics and failure audit. Independent local validation of the final model remains outstanding.</w:t>
+              <w:t>Sections 2–5: recognition metrics and failure audit; distinct actual GPT, local retrieval and controlled cases. Independent local vision validation and broad answer evaluation remain outstanding.</w:t>
             </w:r>
           </w:p>
         </w:tc>
@@ -14550,7 +15428,10 @@
         <w:spacing w:before="200"/>
       </w:pPr>
       <w:r>
-        <w:t>Coverage boundary. The implemented evidence supports decision automation, resource optimisation and cognitive perception. Database storage, access control and interface display are supporting engineering, not a separate knowledge-discovery technique. The proposed GPT/RAG service has not been implemented or evaluated and is not counted towards delivered course coverage.</w:t>
+        <w:rPr>
+          <w:color w:val="000000"/>
+        </w:rPr>
+        <w:t>Coverage boundary. Storage, authorization and interface display support these three technique groups. Targeted GPT/RAG acceptance establishes neither universal semantic accuracy nor the complete proposed evaluation.</w:t>
       </w:r>
     </w:p>
     <w:sectPr>

</xml_diff>